<commit_message>
DATA740: Week06 notes updated with pre-class exercise
</commit_message>
<xml_diff>
--- a/notes/Spring_2026/DATA740/Week06/docx/DATA740_week06_notes.docx
+++ b/notes/Spring_2026/DATA740/Week06/docx/DATA740_week06_notes.docx
@@ -11476,6 +11476,1709 @@
       </w:tr>
     </w:tbl>
     <w:p/>
+    <w:tbl>
+      <w:tblPr>
+        <w:tblStyle w:val="ListTable3-Accent1"/>
+        <w:tblW w:w="0" w:type="auto"/>
+        <w:tblLook w:val="04A0" w:firstRow="1" w:lastRow="0" w:firstColumn="1" w:lastColumn="0" w:noHBand="0" w:noVBand="1"/>
+      </w:tblPr>
+      <w:tblGrid>
+        <w:gridCol w:w="1885"/>
+        <w:gridCol w:w="7465"/>
+      </w:tblGrid>
+      <w:tr>
+        <w:trPr>
+          <w:cnfStyle w:val="100000000000" w:firstRow="1" w:lastRow="0" w:firstColumn="0" w:lastColumn="0" w:oddVBand="0" w:evenVBand="0" w:oddHBand="0" w:evenHBand="0" w:firstRowFirstColumn="0" w:firstRowLastColumn="0" w:lastRowFirstColumn="0" w:lastRowLastColumn="0"/>
+        </w:trPr>
+        <w:tc>
+          <w:tcPr>
+            <w:cnfStyle w:val="001000000100" w:firstRow="0" w:lastRow="0" w:firstColumn="1" w:lastColumn="0" w:oddVBand="0" w:evenVBand="0" w:oddHBand="0" w:evenHBand="0" w:firstRowFirstColumn="1" w:firstRowLastColumn="0" w:lastRowFirstColumn="0" w:lastRowLastColumn="0"/>
+            <w:tcW w:w="9350" w:type="dxa"/>
+            <w:gridSpan w:val="2"/>
+            <w:tcBorders>
+              <w:top w:val="single" w:sz="4" w:space="0" w:color="156082" w:themeColor="accent1"/>
+              <w:right w:val="single" w:sz="4" w:space="0" w:color="156082" w:themeColor="accent1"/>
+            </w:tcBorders>
+          </w:tcPr>
+          <w:p>
+            <w:r>
+              <w:t>ADSA Data Science Ethos</w:t>
+            </w:r>
+          </w:p>
+        </w:tc>
+      </w:tr>
+      <w:tr>
+        <w:trPr>
+          <w:cnfStyle w:val="000000100000" w:firstRow="0" w:lastRow="0" w:firstColumn="0" w:lastColumn="0" w:oddVBand="0" w:evenVBand="0" w:oddHBand="1" w:evenHBand="0" w:firstRowFirstColumn="0" w:firstRowLastColumn="0" w:lastRowFirstColumn="0" w:lastRowLastColumn="0"/>
+        </w:trPr>
+        <w:tc>
+          <w:tcPr>
+            <w:cnfStyle w:val="001000000000" w:firstRow="0" w:lastRow="0" w:firstColumn="1" w:lastColumn="0" w:oddVBand="0" w:evenVBand="0" w:oddHBand="0" w:evenHBand="0" w:firstRowFirstColumn="0" w:firstRowLastColumn="0" w:lastRowFirstColumn="0" w:lastRowLastColumn="0"/>
+            <w:tcW w:w="1885" w:type="dxa"/>
+            <w:shd w:val="clear" w:color="auto" w:fill="F2F2F2" w:themeFill="background1" w:themeFillShade="F2"/>
+          </w:tcPr>
+          <w:p>
+            <w:r>
+              <w:t>The Lenses</w:t>
+            </w:r>
+          </w:p>
+        </w:tc>
+        <w:tc>
+          <w:tcPr>
+            <w:tcW w:w="7465" w:type="dxa"/>
+          </w:tcPr>
+          <w:p>
+            <w:pPr>
+              <w:pStyle w:val="ListParagraph"/>
+              <w:numPr>
+                <w:ilvl w:val="0"/>
+                <w:numId w:val="4"/>
+              </w:numPr>
+              <w:cnfStyle w:val="000000100000" w:firstRow="0" w:lastRow="0" w:firstColumn="0" w:lastColumn="0" w:oddVBand="0" w:evenVBand="0" w:oddHBand="1" w:evenHBand="0" w:firstRowFirstColumn="0" w:firstRowLastColumn="0" w:lastRowFirstColumn="0" w:lastRowLastColumn="0"/>
+            </w:pPr>
+            <w:r>
+              <w:t>Conceptual lenses offer structured ways of </w:t>
+            </w:r>
+            <w:r>
+              <w:rPr>
+                <w:b/>
+                <w:bCs/>
+              </w:rPr>
+              <w:t>thinking about the social and ethical contexts</w:t>
+            </w:r>
+            <w:r>
+              <w:t> relevant to each stage of the data science research process</w:t>
+            </w:r>
+          </w:p>
+          <w:p>
+            <w:pPr>
+              <w:pStyle w:val="ListParagraph"/>
+              <w:numPr>
+                <w:ilvl w:val="0"/>
+                <w:numId w:val="4"/>
+              </w:numPr>
+              <w:cnfStyle w:val="000000100000" w:firstRow="0" w:lastRow="0" w:firstColumn="0" w:lastColumn="0" w:oddVBand="0" w:evenVBand="0" w:oddHBand="1" w:evenHBand="0" w:firstRowFirstColumn="0" w:firstRowLastColumn="0" w:lastRowFirstColumn="0" w:lastRowLastColumn="0"/>
+            </w:pPr>
+            <w:r>
+              <w:t>Each lens represents </w:t>
+            </w:r>
+            <w:r>
+              <w:rPr>
+                <w:b/>
+                <w:bCs/>
+              </w:rPr>
+              <w:t>a theoretical stance connected to specific ethical problems</w:t>
+            </w:r>
+          </w:p>
+          <w:p>
+            <w:pPr>
+              <w:pStyle w:val="ListParagraph"/>
+              <w:numPr>
+                <w:ilvl w:val="0"/>
+                <w:numId w:val="4"/>
+              </w:numPr>
+              <w:cnfStyle w:val="000000100000" w:firstRow="0" w:lastRow="0" w:firstColumn="0" w:lastColumn="0" w:oddVBand="0" w:evenVBand="0" w:oddHBand="1" w:evenHBand="0" w:firstRowFirstColumn="0" w:firstRowLastColumn="0" w:lastRowFirstColumn="0" w:lastRowLastColumn="0"/>
+            </w:pPr>
+            <w:r>
+              <w:rPr>
+                <w:b/>
+                <w:bCs/>
+              </w:rPr>
+              <w:t>Four Lenses</w:t>
+            </w:r>
+          </w:p>
+          <w:p>
+            <w:pPr>
+              <w:pStyle w:val="ListParagraph"/>
+              <w:numPr>
+                <w:ilvl w:val="1"/>
+                <w:numId w:val="4"/>
+              </w:numPr>
+              <w:cnfStyle w:val="000000100000" w:firstRow="0" w:lastRow="0" w:firstColumn="0" w:lastColumn="0" w:oddVBand="0" w:evenVBand="0" w:oddHBand="1" w:evenHBand="0" w:firstRowFirstColumn="0" w:firstRowLastColumn="0" w:lastRowFirstColumn="0" w:lastRowLastColumn="0"/>
+            </w:pPr>
+            <w:r>
+              <w:rPr>
+                <w:b/>
+                <w:bCs/>
+              </w:rPr>
+              <w:t>Positionality</w:t>
+            </w:r>
+          </w:p>
+          <w:p>
+            <w:pPr>
+              <w:pStyle w:val="ListParagraph"/>
+              <w:numPr>
+                <w:ilvl w:val="1"/>
+                <w:numId w:val="4"/>
+              </w:numPr>
+              <w:cnfStyle w:val="000000100000" w:firstRow="0" w:lastRow="0" w:firstColumn="0" w:lastColumn="0" w:oddVBand="0" w:evenVBand="0" w:oddHBand="1" w:evenHBand="0" w:firstRowFirstColumn="0" w:firstRowLastColumn="0" w:lastRowFirstColumn="0" w:lastRowLastColumn="0"/>
+            </w:pPr>
+            <w:r>
+              <w:rPr>
+                <w:b/>
+                <w:bCs/>
+              </w:rPr>
+              <w:t>Sociotechnical Systems</w:t>
+            </w:r>
+          </w:p>
+          <w:p>
+            <w:pPr>
+              <w:pStyle w:val="ListParagraph"/>
+              <w:numPr>
+                <w:ilvl w:val="1"/>
+                <w:numId w:val="4"/>
+              </w:numPr>
+              <w:cnfStyle w:val="000000100000" w:firstRow="0" w:lastRow="0" w:firstColumn="0" w:lastColumn="0" w:oddVBand="0" w:evenVBand="0" w:oddHBand="1" w:evenHBand="0" w:firstRowFirstColumn="0" w:firstRowLastColumn="0" w:lastRowFirstColumn="0" w:lastRowLastColumn="0"/>
+            </w:pPr>
+            <w:r>
+              <w:rPr>
+                <w:b/>
+                <w:bCs/>
+              </w:rPr>
+              <w:t>Power</w:t>
+            </w:r>
+          </w:p>
+          <w:p>
+            <w:pPr>
+              <w:pStyle w:val="ListParagraph"/>
+              <w:numPr>
+                <w:ilvl w:val="1"/>
+                <w:numId w:val="4"/>
+              </w:numPr>
+              <w:cnfStyle w:val="000000100000" w:firstRow="0" w:lastRow="0" w:firstColumn="0" w:lastColumn="0" w:oddVBand="0" w:evenVBand="0" w:oddHBand="1" w:evenHBand="0" w:firstRowFirstColumn="0" w:firstRowLastColumn="0" w:lastRowFirstColumn="0" w:lastRowLastColumn="0"/>
+            </w:pPr>
+            <w:r>
+              <w:rPr>
+                <w:b/>
+                <w:bCs/>
+              </w:rPr>
+              <w:t>Narratives</w:t>
+            </w:r>
+          </w:p>
+        </w:tc>
+      </w:tr>
+      <w:tr>
+        <w:tc>
+          <w:tcPr>
+            <w:cnfStyle w:val="001000000000" w:firstRow="0" w:lastRow="0" w:firstColumn="1" w:lastColumn="0" w:oddVBand="0" w:evenVBand="0" w:oddHBand="0" w:evenHBand="0" w:firstRowFirstColumn="0" w:firstRowLastColumn="0" w:lastRowFirstColumn="0" w:lastRowLastColumn="0"/>
+            <w:tcW w:w="1885" w:type="dxa"/>
+            <w:shd w:val="clear" w:color="auto" w:fill="F2F2F2" w:themeFill="background1" w:themeFillShade="F2"/>
+          </w:tcPr>
+          <w:p>
+            <w:r>
+              <w:t>The Stages</w:t>
+            </w:r>
+          </w:p>
+        </w:tc>
+        <w:tc>
+          <w:tcPr>
+            <w:tcW w:w="7465" w:type="dxa"/>
+          </w:tcPr>
+          <w:p>
+            <w:pPr>
+              <w:pStyle w:val="ListParagraph"/>
+              <w:numPr>
+                <w:ilvl w:val="0"/>
+                <w:numId w:val="5"/>
+              </w:numPr>
+              <w:cnfStyle w:val="000000000000" w:firstRow="0" w:lastRow="0" w:firstColumn="0" w:lastColumn="0" w:oddVBand="0" w:evenVBand="0" w:oddHBand="0" w:evenHBand="0" w:firstRowFirstColumn="0" w:firstRowLastColumn="0" w:lastRowFirstColumn="0" w:lastRowLastColumn="0"/>
+            </w:pPr>
+            <w:r>
+              <w:t>question</w:t>
+            </w:r>
+          </w:p>
+          <w:p>
+            <w:pPr>
+              <w:pStyle w:val="ListParagraph"/>
+              <w:numPr>
+                <w:ilvl w:val="0"/>
+                <w:numId w:val="5"/>
+              </w:numPr>
+              <w:cnfStyle w:val="000000000000" w:firstRow="0" w:lastRow="0" w:firstColumn="0" w:lastColumn="0" w:oddVBand="0" w:evenVBand="0" w:oddHBand="0" w:evenHBand="0" w:firstRowFirstColumn="0" w:firstRowLastColumn="0" w:lastRowFirstColumn="0" w:lastRowLastColumn="0"/>
+            </w:pPr>
+            <w:r>
+              <w:t>discovery</w:t>
+            </w:r>
+          </w:p>
+          <w:p>
+            <w:pPr>
+              <w:pStyle w:val="ListParagraph"/>
+              <w:numPr>
+                <w:ilvl w:val="0"/>
+                <w:numId w:val="5"/>
+              </w:numPr>
+              <w:cnfStyle w:val="000000000000" w:firstRow="0" w:lastRow="0" w:firstColumn="0" w:lastColumn="0" w:oddVBand="0" w:evenVBand="0" w:oddHBand="0" w:evenHBand="0" w:firstRowFirstColumn="0" w:firstRowLastColumn="0" w:lastRowFirstColumn="0" w:lastRowLastColumn="0"/>
+            </w:pPr>
+            <w:r>
+              <w:t>analysis</w:t>
+            </w:r>
+          </w:p>
+          <w:p>
+            <w:pPr>
+              <w:pStyle w:val="ListParagraph"/>
+              <w:numPr>
+                <w:ilvl w:val="0"/>
+                <w:numId w:val="5"/>
+              </w:numPr>
+              <w:cnfStyle w:val="000000000000" w:firstRow="0" w:lastRow="0" w:firstColumn="0" w:lastColumn="0" w:oddVBand="0" w:evenVBand="0" w:oddHBand="0" w:evenHBand="0" w:firstRowFirstColumn="0" w:firstRowLastColumn="0" w:lastRowFirstColumn="0" w:lastRowLastColumn="0"/>
+            </w:pPr>
+            <w:r>
+              <w:t>modeling</w:t>
+            </w:r>
+          </w:p>
+          <w:p>
+            <w:pPr>
+              <w:pStyle w:val="ListParagraph"/>
+              <w:numPr>
+                <w:ilvl w:val="0"/>
+                <w:numId w:val="5"/>
+              </w:numPr>
+              <w:cnfStyle w:val="000000000000" w:firstRow="0" w:lastRow="0" w:firstColumn="0" w:lastColumn="0" w:oddVBand="0" w:evenVBand="0" w:oddHBand="0" w:evenHBand="0" w:firstRowFirstColumn="0" w:firstRowLastColumn="0" w:lastRowFirstColumn="0" w:lastRowLastColumn="0"/>
+            </w:pPr>
+            <w:r>
+              <w:t>interpreting</w:t>
+            </w:r>
+          </w:p>
+          <w:p>
+            <w:pPr>
+              <w:pStyle w:val="ListParagraph"/>
+              <w:numPr>
+                <w:ilvl w:val="0"/>
+                <w:numId w:val="5"/>
+              </w:numPr>
+              <w:cnfStyle w:val="000000000000" w:firstRow="0" w:lastRow="0" w:firstColumn="0" w:lastColumn="0" w:oddVBand="0" w:evenVBand="0" w:oddHBand="0" w:evenHBand="0" w:firstRowFirstColumn="0" w:firstRowLastColumn="0" w:lastRowFirstColumn="0" w:lastRowLastColumn="0"/>
+            </w:pPr>
+            <w:r>
+              <w:t>sharing</w:t>
+            </w:r>
+          </w:p>
+        </w:tc>
+      </w:tr>
+      <w:tr>
+        <w:trPr>
+          <w:cnfStyle w:val="000000100000" w:firstRow="0" w:lastRow="0" w:firstColumn="0" w:lastColumn="0" w:oddVBand="0" w:evenVBand="0" w:oddHBand="1" w:evenHBand="0" w:firstRowFirstColumn="0" w:firstRowLastColumn="0" w:lastRowFirstColumn="0" w:lastRowLastColumn="0"/>
+        </w:trPr>
+        <w:tc>
+          <w:tcPr>
+            <w:cnfStyle w:val="001000000000" w:firstRow="0" w:lastRow="0" w:firstColumn="1" w:lastColumn="0" w:oddVBand="0" w:evenVBand="0" w:oddHBand="0" w:evenHBand="0" w:firstRowFirstColumn="0" w:firstRowLastColumn="0" w:lastRowFirstColumn="0" w:lastRowLastColumn="0"/>
+            <w:tcW w:w="1885" w:type="dxa"/>
+            <w:shd w:val="clear" w:color="auto" w:fill="F2F2F2" w:themeFill="background1" w:themeFillShade="F2"/>
+          </w:tcPr>
+          <w:p>
+            <w:r>
+              <w:t>Case Studies</w:t>
+            </w:r>
+          </w:p>
+        </w:tc>
+        <w:tc>
+          <w:tcPr>
+            <w:tcW w:w="7465" w:type="dxa"/>
+          </w:tcPr>
+          <w:p>
+            <w:pPr>
+              <w:pStyle w:val="ListParagraph"/>
+              <w:numPr>
+                <w:ilvl w:val="0"/>
+                <w:numId w:val="6"/>
+              </w:numPr>
+              <w:cnfStyle w:val="000000100000" w:firstRow="0" w:lastRow="0" w:firstColumn="0" w:lastColumn="0" w:oddVBand="0" w:evenVBand="0" w:oddHBand="1" w:evenHBand="0" w:firstRowFirstColumn="0" w:firstRowLastColumn="0" w:lastRowFirstColumn="0" w:lastRowLastColumn="0"/>
+            </w:pPr>
+            <w:r>
+              <w:t>estimating population with phone records</w:t>
+            </w:r>
+          </w:p>
+          <w:p>
+            <w:pPr>
+              <w:pStyle w:val="ListParagraph"/>
+              <w:numPr>
+                <w:ilvl w:val="0"/>
+                <w:numId w:val="6"/>
+              </w:numPr>
+              <w:cnfStyle w:val="000000100000" w:firstRow="0" w:lastRow="0" w:firstColumn="0" w:lastColumn="0" w:oddVBand="0" w:evenVBand="0" w:oddHBand="1" w:evenHBand="0" w:firstRowFirstColumn="0" w:firstRowLastColumn="0" w:lastRowFirstColumn="0" w:lastRowLastColumn="0"/>
+            </w:pPr>
+            <w:r>
+              <w:t>unfair tax practices in major U.S. cities</w:t>
+            </w:r>
+          </w:p>
+          <w:p>
+            <w:pPr>
+              <w:pStyle w:val="ListParagraph"/>
+              <w:numPr>
+                <w:ilvl w:val="0"/>
+                <w:numId w:val="6"/>
+              </w:numPr>
+              <w:cnfStyle w:val="000000100000" w:firstRow="0" w:lastRow="0" w:firstColumn="0" w:lastColumn="0" w:oddVBand="0" w:evenVBand="0" w:oddHBand="1" w:evenHBand="0" w:firstRowFirstColumn="0" w:firstRowLastColumn="0" w:lastRowFirstColumn="0" w:lastRowLastColumn="0"/>
+            </w:pPr>
+            <w:r>
+              <w:t>Crowd The Tap: protecting tap water</w:t>
+            </w:r>
+          </w:p>
+        </w:tc>
+      </w:tr>
+      <w:tr>
+        <w:tc>
+          <w:tcPr>
+            <w:cnfStyle w:val="001000000000" w:firstRow="0" w:lastRow="0" w:firstColumn="1" w:lastColumn="0" w:oddVBand="0" w:evenVBand="0" w:oddHBand="0" w:evenHBand="0" w:firstRowFirstColumn="0" w:firstRowLastColumn="0" w:lastRowFirstColumn="0" w:lastRowLastColumn="0"/>
+            <w:tcW w:w="9350" w:type="dxa"/>
+            <w:gridSpan w:val="2"/>
+            <w:tcBorders>
+              <w:right w:val="single" w:sz="4" w:space="0" w:color="156082" w:themeColor="accent1"/>
+            </w:tcBorders>
+            <w:shd w:val="clear" w:color="auto" w:fill="DAE9F7" w:themeFill="text2" w:themeFillTint="1A"/>
+          </w:tcPr>
+          <w:p>
+            <w:pPr>
+              <w:pStyle w:val="ListParagraph"/>
+              <w:ind w:left="0"/>
+            </w:pPr>
+            <w:r>
+              <w:t>Estimating Population with Phone Records</w:t>
+            </w:r>
+          </w:p>
+        </w:tc>
+      </w:tr>
+      <w:tr>
+        <w:trPr>
+          <w:cnfStyle w:val="000000100000" w:firstRow="0" w:lastRow="0" w:firstColumn="0" w:lastColumn="0" w:oddVBand="0" w:evenVBand="0" w:oddHBand="1" w:evenHBand="0" w:firstRowFirstColumn="0" w:firstRowLastColumn="0" w:lastRowFirstColumn="0" w:lastRowLastColumn="0"/>
+        </w:trPr>
+        <w:tc>
+          <w:tcPr>
+            <w:cnfStyle w:val="001000000000" w:firstRow="0" w:lastRow="0" w:firstColumn="1" w:lastColumn="0" w:oddVBand="0" w:evenVBand="0" w:oddHBand="0" w:evenHBand="0" w:firstRowFirstColumn="0" w:firstRowLastColumn="0" w:lastRowFirstColumn="0" w:lastRowLastColumn="0"/>
+            <w:tcW w:w="1885" w:type="dxa"/>
+            <w:shd w:val="clear" w:color="auto" w:fill="F2F2F2" w:themeFill="background1" w:themeFillShade="F2"/>
+          </w:tcPr>
+          <w:p>
+            <w:r>
+              <w:t>Summary</w:t>
+            </w:r>
+          </w:p>
+        </w:tc>
+        <w:tc>
+          <w:tcPr>
+            <w:tcW w:w="7465" w:type="dxa"/>
+          </w:tcPr>
+          <w:p>
+            <w:pPr>
+              <w:pStyle w:val="ListParagraph"/>
+              <w:numPr>
+                <w:ilvl w:val="0"/>
+                <w:numId w:val="6"/>
+              </w:numPr>
+              <w:cnfStyle w:val="000000100000" w:firstRow="0" w:lastRow="0" w:firstColumn="0" w:lastColumn="0" w:oddVBand="0" w:evenVBand="0" w:oddHBand="1" w:evenHBand="0" w:firstRowFirstColumn="0" w:firstRowLastColumn="0" w:lastRowFirstColumn="0" w:lastRowLastColumn="0"/>
+            </w:pPr>
+            <w:r>
+              <w:t>enumerations of populations and their economic status are collected for many essential purposes</w:t>
+            </w:r>
+          </w:p>
+          <w:p>
+            <w:pPr>
+              <w:pStyle w:val="ListParagraph"/>
+              <w:numPr>
+                <w:ilvl w:val="1"/>
+                <w:numId w:val="6"/>
+              </w:numPr>
+              <w:cnfStyle w:val="000000100000" w:firstRow="0" w:lastRow="0" w:firstColumn="0" w:lastColumn="0" w:oddVBand="0" w:evenVBand="0" w:oddHBand="1" w:evenHBand="0" w:firstRowFirstColumn="0" w:firstRowLastColumn="0" w:lastRowFirstColumn="0" w:lastRowLastColumn="0"/>
+            </w:pPr>
+            <w:r>
+              <w:t>determining electoral representation</w:t>
+            </w:r>
+          </w:p>
+          <w:p>
+            <w:pPr>
+              <w:pStyle w:val="ListParagraph"/>
+              <w:numPr>
+                <w:ilvl w:val="1"/>
+                <w:numId w:val="6"/>
+              </w:numPr>
+              <w:cnfStyle w:val="000000100000" w:firstRow="0" w:lastRow="0" w:firstColumn="0" w:lastColumn="0" w:oddVBand="0" w:evenVBand="0" w:oddHBand="1" w:evenHBand="0" w:firstRowFirstColumn="0" w:firstRowLastColumn="0" w:lastRowFirstColumn="0" w:lastRowLastColumn="0"/>
+            </w:pPr>
+            <w:r>
+              <w:t>allocating tax dollars</w:t>
+            </w:r>
+          </w:p>
+          <w:p>
+            <w:pPr>
+              <w:pStyle w:val="ListParagraph"/>
+              <w:numPr>
+                <w:ilvl w:val="1"/>
+                <w:numId w:val="6"/>
+              </w:numPr>
+              <w:cnfStyle w:val="000000100000" w:firstRow="0" w:lastRow="0" w:firstColumn="0" w:lastColumn="0" w:oddVBand="0" w:evenVBand="0" w:oddHBand="1" w:evenHBand="0" w:firstRowFirstColumn="0" w:firstRowLastColumn="0" w:lastRowFirstColumn="0" w:lastRowLastColumn="0"/>
+            </w:pPr>
+            <w:r>
+              <w:t>deploying public health interventions</w:t>
+            </w:r>
+          </w:p>
+          <w:p>
+            <w:pPr>
+              <w:pStyle w:val="ListParagraph"/>
+              <w:numPr>
+                <w:ilvl w:val="0"/>
+                <w:numId w:val="6"/>
+              </w:numPr>
+              <w:cnfStyle w:val="000000100000" w:firstRow="0" w:lastRow="0" w:firstColumn="0" w:lastColumn="0" w:oddVBand="0" w:evenVBand="0" w:oddHBand="1" w:evenHBand="0" w:firstRowFirstColumn="0" w:firstRowLastColumn="0" w:lastRowFirstColumn="0" w:lastRowLastColumn="0"/>
+            </w:pPr>
+            <w:r>
+              <w:t>census are performed to collect this data, but they are expensive</w:t>
+            </w:r>
+            <w:r>
+              <w:t>, time consuming,</w:t>
+            </w:r>
+            <w:r>
+              <w:t xml:space="preserve"> and infrequen</w:t>
+            </w:r>
+            <w:r>
+              <w:t>t</w:t>
+            </w:r>
+          </w:p>
+          <w:p>
+            <w:pPr>
+              <w:pStyle w:val="ListParagraph"/>
+              <w:numPr>
+                <w:ilvl w:val="0"/>
+                <w:numId w:val="6"/>
+              </w:numPr>
+              <w:cnfStyle w:val="000000100000" w:firstRow="0" w:lastRow="0" w:firstColumn="0" w:lastColumn="0" w:oddVBand="0" w:evenVBand="0" w:oddHBand="1" w:evenHBand="0" w:firstRowFirstColumn="0" w:firstRowLastColumn="0" w:lastRowFirstColumn="0" w:lastRowLastColumn="0"/>
+            </w:pPr>
+          </w:p>
+        </w:tc>
+      </w:tr>
+      <w:tr>
+        <w:tc>
+          <w:tcPr>
+            <w:cnfStyle w:val="001000000000" w:firstRow="0" w:lastRow="0" w:firstColumn="1" w:lastColumn="0" w:oddVBand="0" w:evenVBand="0" w:oddHBand="0" w:evenHBand="0" w:firstRowFirstColumn="0" w:firstRowLastColumn="0" w:lastRowFirstColumn="0" w:lastRowLastColumn="0"/>
+            <w:tcW w:w="1885" w:type="dxa"/>
+            <w:shd w:val="clear" w:color="auto" w:fill="F2F2F2" w:themeFill="background1" w:themeFillShade="F2"/>
+          </w:tcPr>
+          <w:p>
+            <w:r>
+              <w:t>Positionality</w:t>
+            </w:r>
+          </w:p>
+        </w:tc>
+        <w:tc>
+          <w:tcPr>
+            <w:tcW w:w="7465" w:type="dxa"/>
+          </w:tcPr>
+          <w:p>
+            <w:pPr>
+              <w:pStyle w:val="ListParagraph"/>
+              <w:numPr>
+                <w:ilvl w:val="0"/>
+                <w:numId w:val="6"/>
+              </w:numPr>
+              <w:cnfStyle w:val="000000000000" w:firstRow="0" w:lastRow="0" w:firstColumn="0" w:lastColumn="0" w:oddVBand="0" w:evenVBand="0" w:oddHBand="0" w:evenHBand="0" w:firstRowFirstColumn="0" w:firstRowLastColumn="0" w:lastRowFirstColumn="0" w:lastRowLastColumn="0"/>
+            </w:pPr>
+            <w:r>
+              <w:t>use lens of positionality to examine the Data Discovery stage of a project using mobile phone records to estimate population size and economic status</w:t>
+            </w:r>
+          </w:p>
+          <w:p>
+            <w:pPr>
+              <w:pStyle w:val="ListParagraph"/>
+              <w:numPr>
+                <w:ilvl w:val="0"/>
+                <w:numId w:val="6"/>
+              </w:numPr>
+              <w:cnfStyle w:val="000000000000" w:firstRow="0" w:lastRow="0" w:firstColumn="0" w:lastColumn="0" w:oddVBand="0" w:evenVBand="0" w:oddHBand="0" w:evenHBand="0" w:firstRowFirstColumn="0" w:firstRowLastColumn="0" w:lastRowFirstColumn="0" w:lastRowLastColumn="0"/>
+            </w:pPr>
+            <w:r>
+              <w:t>when researchers work with sensitive data (ex: phone records) the data is obfuscated to protect individual identities</w:t>
+            </w:r>
+          </w:p>
+          <w:p>
+            <w:pPr>
+              <w:pStyle w:val="ListParagraph"/>
+              <w:numPr>
+                <w:ilvl w:val="0"/>
+                <w:numId w:val="6"/>
+              </w:numPr>
+              <w:cnfStyle w:val="000000000000" w:firstRow="0" w:lastRow="0" w:firstColumn="0" w:lastColumn="0" w:oddVBand="0" w:evenVBand="0" w:oddHBand="0" w:evenHBand="0" w:firstRowFirstColumn="0" w:firstRowLastColumn="0" w:lastRowFirstColumn="0" w:lastRowLastColumn="0"/>
+            </w:pPr>
+            <w:r>
+              <w:lastRenderedPageBreak/>
+              <w:t>what culturally derived assumptions are being made?</w:t>
+            </w:r>
+          </w:p>
+          <w:p>
+            <w:pPr>
+              <w:pStyle w:val="ListParagraph"/>
+              <w:numPr>
+                <w:ilvl w:val="1"/>
+                <w:numId w:val="6"/>
+              </w:numPr>
+              <w:cnfStyle w:val="000000000000" w:firstRow="0" w:lastRow="0" w:firstColumn="0" w:lastColumn="0" w:oddVBand="0" w:evenVBand="0" w:oddHBand="0" w:evenHBand="0" w:firstRowFirstColumn="0" w:firstRowLastColumn="0" w:lastRowFirstColumn="0" w:lastRowLastColumn="0"/>
+            </w:pPr>
+            <w:r>
+              <w:t>for a culture that prized individual</w:t>
+            </w:r>
+            <w:r>
+              <w:t xml:space="preserve"> liberties over collective well-being, the priority data protection effort would logically be assumed to be the protection of identities </w:t>
+            </w:r>
+            <w:r>
+              <w:t xml:space="preserve">while overlooking the harm that can be done to segments of the population if their locations are revealed </w:t>
+            </w:r>
+            <w:r>
+              <w:rPr>
+                <w:i/>
+                <w:iCs/>
+                <w:color w:val="EE0000"/>
+                <w:sz w:val="16"/>
+                <w:szCs w:val="16"/>
+              </w:rPr>
+              <w:t>WHAT?</w:t>
+            </w:r>
+          </w:p>
+        </w:tc>
+      </w:tr>
+      <w:tr>
+        <w:trPr>
+          <w:cnfStyle w:val="000000100000" w:firstRow="0" w:lastRow="0" w:firstColumn="0" w:lastColumn="0" w:oddVBand="0" w:evenVBand="0" w:oddHBand="1" w:evenHBand="0" w:firstRowFirstColumn="0" w:firstRowLastColumn="0" w:lastRowFirstColumn="0" w:lastRowLastColumn="0"/>
+        </w:trPr>
+        <w:tc>
+          <w:tcPr>
+            <w:cnfStyle w:val="001000000000" w:firstRow="0" w:lastRow="0" w:firstColumn="1" w:lastColumn="0" w:oddVBand="0" w:evenVBand="0" w:oddHBand="0" w:evenHBand="0" w:firstRowFirstColumn="0" w:firstRowLastColumn="0" w:lastRowFirstColumn="0" w:lastRowLastColumn="0"/>
+            <w:tcW w:w="1885" w:type="dxa"/>
+            <w:shd w:val="clear" w:color="auto" w:fill="F2F2F2" w:themeFill="background1" w:themeFillShade="F2"/>
+          </w:tcPr>
+          <w:p>
+            <w:r>
+              <w:lastRenderedPageBreak/>
+              <w:t>Power</w:t>
+            </w:r>
+          </w:p>
+        </w:tc>
+        <w:tc>
+          <w:tcPr>
+            <w:tcW w:w="7465" w:type="dxa"/>
+          </w:tcPr>
+          <w:p>
+            <w:pPr>
+              <w:pStyle w:val="ListParagraph"/>
+              <w:numPr>
+                <w:ilvl w:val="0"/>
+                <w:numId w:val="6"/>
+              </w:numPr>
+              <w:cnfStyle w:val="000000100000" w:firstRow="0" w:lastRow="0" w:firstColumn="0" w:lastColumn="0" w:oddVBand="0" w:evenVBand="0" w:oddHBand="1" w:evenHBand="0" w:firstRowFirstColumn="0" w:firstRowLastColumn="0" w:lastRowFirstColumn="0" w:lastRowLastColumn="0"/>
+            </w:pPr>
+            <w:r>
+              <w:t xml:space="preserve">in the case of </w:t>
+            </w:r>
+            <w:r>
+              <w:t>using mobile phone records to estimate population size, location, and economic status, it is essential to remember during the Data Discovery stage that for-profit businesses have the power to decide what data they will share, with whom, and under what condition</w:t>
+            </w:r>
+          </w:p>
+          <w:p>
+            <w:pPr>
+              <w:pStyle w:val="ListParagraph"/>
+              <w:numPr>
+                <w:ilvl w:val="0"/>
+                <w:numId w:val="6"/>
+              </w:numPr>
+              <w:cnfStyle w:val="000000100000" w:firstRow="0" w:lastRow="0" w:firstColumn="0" w:lastColumn="0" w:oddVBand="0" w:evenVBand="0" w:oddHBand="1" w:evenHBand="0" w:firstRowFirstColumn="0" w:firstRowLastColumn="0" w:lastRowFirstColumn="0" w:lastRowLastColumn="0"/>
+            </w:pPr>
+            <w:r>
+              <w:t>if a company makes their phone records freely available to researchers, what it their motivation</w:t>
+            </w:r>
+            <w:r>
+              <w:t>? altruism? pride? financial or political gain?</w:t>
+            </w:r>
+          </w:p>
+          <w:p>
+            <w:pPr>
+              <w:pStyle w:val="ListParagraph"/>
+              <w:numPr>
+                <w:ilvl w:val="0"/>
+                <w:numId w:val="6"/>
+              </w:numPr>
+              <w:cnfStyle w:val="000000100000" w:firstRow="0" w:lastRow="0" w:firstColumn="0" w:lastColumn="0" w:oddVBand="0" w:evenVBand="0" w:oddHBand="1" w:evenHBand="0" w:firstRowFirstColumn="0" w:firstRowLastColumn="0" w:lastRowFirstColumn="0" w:lastRowLastColumn="0"/>
+            </w:pPr>
+            <w:r>
+              <w:t>can the data be trusted?</w:t>
+            </w:r>
+          </w:p>
+        </w:tc>
+      </w:tr>
+      <w:tr>
+        <w:tc>
+          <w:tcPr>
+            <w:cnfStyle w:val="001000000000" w:firstRow="0" w:lastRow="0" w:firstColumn="1" w:lastColumn="0" w:oddVBand="0" w:evenVBand="0" w:oddHBand="0" w:evenHBand="0" w:firstRowFirstColumn="0" w:firstRowLastColumn="0" w:lastRowFirstColumn="0" w:lastRowLastColumn="0"/>
+            <w:tcW w:w="1885" w:type="dxa"/>
+            <w:shd w:val="clear" w:color="auto" w:fill="F2F2F2" w:themeFill="background1" w:themeFillShade="F2"/>
+          </w:tcPr>
+          <w:p>
+            <w:r>
+              <w:t>Sociotechnical Systems</w:t>
+            </w:r>
+          </w:p>
+        </w:tc>
+        <w:tc>
+          <w:tcPr>
+            <w:tcW w:w="7465" w:type="dxa"/>
+          </w:tcPr>
+          <w:p>
+            <w:pPr>
+              <w:pStyle w:val="ListParagraph"/>
+              <w:numPr>
+                <w:ilvl w:val="0"/>
+                <w:numId w:val="6"/>
+              </w:numPr>
+              <w:cnfStyle w:val="000000000000" w:firstRow="0" w:lastRow="0" w:firstColumn="0" w:lastColumn="0" w:oddVBand="0" w:evenVBand="0" w:oddHBand="0" w:evenHBand="0" w:firstRowFirstColumn="0" w:firstRowLastColumn="0" w:lastRowFirstColumn="0" w:lastRowLastColumn="0"/>
+            </w:pPr>
+            <w:r>
+              <w:t>how are the systems that generated the data intertwined with the lives of real people</w:t>
+            </w:r>
+            <w:r>
+              <w:t xml:space="preserve"> </w:t>
+            </w:r>
+          </w:p>
+          <w:p>
+            <w:pPr>
+              <w:pStyle w:val="ListParagraph"/>
+              <w:numPr>
+                <w:ilvl w:val="0"/>
+                <w:numId w:val="6"/>
+              </w:numPr>
+              <w:cnfStyle w:val="000000000000" w:firstRow="0" w:lastRow="0" w:firstColumn="0" w:lastColumn="0" w:oddVBand="0" w:evenVBand="0" w:oddHBand="0" w:evenHBand="0" w:firstRowFirstColumn="0" w:firstRowLastColumn="0" w:lastRowFirstColumn="0" w:lastRowLastColumn="0"/>
+            </w:pPr>
+            <w:r>
+              <w:t>in some regions a phone number uniquely identifies a single person while other regions a single phone can be shared by a whole family or village</w:t>
+            </w:r>
+          </w:p>
+        </w:tc>
+      </w:tr>
+      <w:tr>
+        <w:trPr>
+          <w:cnfStyle w:val="000000100000" w:firstRow="0" w:lastRow="0" w:firstColumn="0" w:lastColumn="0" w:oddVBand="0" w:evenVBand="0" w:oddHBand="1" w:evenHBand="0" w:firstRowFirstColumn="0" w:firstRowLastColumn="0" w:lastRowFirstColumn="0" w:lastRowLastColumn="0"/>
+        </w:trPr>
+        <w:tc>
+          <w:tcPr>
+            <w:cnfStyle w:val="001000000000" w:firstRow="0" w:lastRow="0" w:firstColumn="1" w:lastColumn="0" w:oddVBand="0" w:evenVBand="0" w:oddHBand="0" w:evenHBand="0" w:firstRowFirstColumn="0" w:firstRowLastColumn="0" w:lastRowFirstColumn="0" w:lastRowLastColumn="0"/>
+            <w:tcW w:w="1885" w:type="dxa"/>
+            <w:shd w:val="clear" w:color="auto" w:fill="F2F2F2" w:themeFill="background1" w:themeFillShade="F2"/>
+          </w:tcPr>
+          <w:p>
+            <w:r>
+              <w:t>Narrative</w:t>
+            </w:r>
+          </w:p>
+        </w:tc>
+        <w:tc>
+          <w:tcPr>
+            <w:tcW w:w="7465" w:type="dxa"/>
+          </w:tcPr>
+          <w:p>
+            <w:pPr>
+              <w:pStyle w:val="ListParagraph"/>
+              <w:numPr>
+                <w:ilvl w:val="0"/>
+                <w:numId w:val="6"/>
+              </w:numPr>
+              <w:cnfStyle w:val="000000100000" w:firstRow="0" w:lastRow="0" w:firstColumn="0" w:lastColumn="0" w:oddVBand="0" w:evenVBand="0" w:oddHBand="1" w:evenHBand="0" w:firstRowFirstColumn="0" w:firstRowLastColumn="0" w:lastRowFirstColumn="0" w:lastRowLastColumn="0"/>
+            </w:pPr>
+            <w:r>
+              <w:t>a project to study populations using mobile phone data is likely animated by a narrative that celebrates the ability and innovations of using readily available data in place of the painstaking process of data collection involved in conducting a census</w:t>
+            </w:r>
+          </w:p>
+        </w:tc>
+      </w:tr>
+      <w:tr>
+        <w:tc>
+          <w:tcPr>
+            <w:cnfStyle w:val="001000000000" w:firstRow="0" w:lastRow="0" w:firstColumn="1" w:lastColumn="0" w:oddVBand="0" w:evenVBand="0" w:oddHBand="0" w:evenHBand="0" w:firstRowFirstColumn="0" w:firstRowLastColumn="0" w:lastRowFirstColumn="0" w:lastRowLastColumn="0"/>
+            <w:tcW w:w="9350" w:type="dxa"/>
+            <w:gridSpan w:val="2"/>
+            <w:tcBorders>
+              <w:bottom w:val="single" w:sz="36" w:space="0" w:color="156082" w:themeColor="accent1"/>
+              <w:right w:val="single" w:sz="4" w:space="0" w:color="156082" w:themeColor="accent1"/>
+            </w:tcBorders>
+            <w:shd w:val="clear" w:color="auto" w:fill="D9D9D9" w:themeFill="background1" w:themeFillShade="D9"/>
+          </w:tcPr>
+          <w:p/>
+        </w:tc>
+      </w:tr>
+      <w:tr>
+        <w:trPr>
+          <w:cnfStyle w:val="000000100000" w:firstRow="0" w:lastRow="0" w:firstColumn="0" w:lastColumn="0" w:oddVBand="0" w:evenVBand="0" w:oddHBand="1" w:evenHBand="0" w:firstRowFirstColumn="0" w:firstRowLastColumn="0" w:lastRowFirstColumn="0" w:lastRowLastColumn="0"/>
+        </w:trPr>
+        <w:tc>
+          <w:tcPr>
+            <w:cnfStyle w:val="001000000000" w:firstRow="0" w:lastRow="0" w:firstColumn="1" w:lastColumn="0" w:oddVBand="0" w:evenVBand="0" w:oddHBand="0" w:evenHBand="0" w:firstRowFirstColumn="0" w:firstRowLastColumn="0" w:lastRowFirstColumn="0" w:lastRowLastColumn="0"/>
+            <w:tcW w:w="9350" w:type="dxa"/>
+            <w:gridSpan w:val="2"/>
+            <w:tcBorders>
+              <w:top w:val="single" w:sz="36" w:space="0" w:color="156082" w:themeColor="accent1"/>
+              <w:left w:val="single" w:sz="4" w:space="0" w:color="156082" w:themeColor="accent1"/>
+              <w:bottom w:val="single" w:sz="36" w:space="0" w:color="156082" w:themeColor="accent1"/>
+              <w:right w:val="single" w:sz="4" w:space="0" w:color="156082" w:themeColor="accent1"/>
+            </w:tcBorders>
+            <w:shd w:val="clear" w:color="auto" w:fill="F2F2F2" w:themeFill="background1" w:themeFillShade="F2"/>
+          </w:tcPr>
+          <w:p>
+            <w:pPr>
+              <w:rPr>
+                <w:b w:val="0"/>
+                <w:bCs w:val="0"/>
+              </w:rPr>
+            </w:pPr>
+          </w:p>
+          <w:p>
+            <w:pPr>
+              <w:rPr>
+                <w:b w:val="0"/>
+                <w:bCs w:val="0"/>
+              </w:rPr>
+            </w:pPr>
+            <w:r>
+              <w:t xml:space="preserve">I chose the case study involving collecting census data using mobile phone data. I chose this case study because it seemed to present some interesting challenges both logistically and ethically. Logistically, there would have to be a lot of assumptions made specifically concerning active mobile phone accounts per capita in a particular region. How would one even obtain such data? If you had a mechanism in place to determine such data, why could that mechanism not be used to collect the needed data? This would fall under the lens of Sociotechnical Systems along with other factors that make assumptions on how the systems producing the data are related to and “intertwined” with the people represented in the data. </w:t>
+            </w:r>
+          </w:p>
+          <w:p>
+            <w:pPr>
+              <w:rPr>
+                <w:b w:val="0"/>
+                <w:bCs w:val="0"/>
+              </w:rPr>
+            </w:pPr>
+          </w:p>
+        </w:tc>
+      </w:tr>
+    </w:tbl>
+    <w:p/>
+    <w:p>
+      <w:r>
+        <w:br w:type="page"/>
+      </w:r>
+    </w:p>
+    <w:tbl>
+      <w:tblPr>
+        <w:tblStyle w:val="GridTable1Light-Accent1"/>
+        <w:tblW w:w="9481" w:type="dxa"/>
+        <w:tblCellMar>
+          <w:top w:w="29" w:type="dxa"/>
+          <w:bottom w:w="29" w:type="dxa"/>
+        </w:tblCellMar>
+        <w:tblLook w:val="04A0" w:firstRow="1" w:lastRow="0" w:firstColumn="1" w:lastColumn="0" w:noHBand="0" w:noVBand="1"/>
+      </w:tblPr>
+      <w:tblGrid>
+        <w:gridCol w:w="5136"/>
+        <w:gridCol w:w="2151"/>
+        <w:gridCol w:w="2159"/>
+        <w:gridCol w:w="35"/>
+      </w:tblGrid>
+      <w:tr>
+        <w:trPr>
+          <w:cnfStyle w:val="100000000000" w:firstRow="1" w:lastRow="0" w:firstColumn="0" w:lastColumn="0" w:oddVBand="0" w:evenVBand="0" w:oddHBand="0" w:evenHBand="0" w:firstRowFirstColumn="0" w:firstRowLastColumn="0" w:lastRowFirstColumn="0" w:lastRowLastColumn="0"/>
+          <w:trHeight w:val="368"/>
+        </w:trPr>
+        <w:tc>
+          <w:tcPr>
+            <w:cnfStyle w:val="001000000000" w:firstRow="0" w:lastRow="0" w:firstColumn="1" w:lastColumn="0" w:oddVBand="0" w:evenVBand="0" w:oddHBand="0" w:evenHBand="0" w:firstRowFirstColumn="0" w:firstRowLastColumn="0" w:lastRowFirstColumn="0" w:lastRowLastColumn="0"/>
+            <w:tcW w:w="5215" w:type="dxa"/>
+            <w:tcBorders>
+              <w:top w:val="single" w:sz="4" w:space="0" w:color="000000" w:themeColor="text1"/>
+              <w:left w:val="single" w:sz="4" w:space="0" w:color="000000" w:themeColor="text1"/>
+              <w:bottom w:val="single" w:sz="4" w:space="0" w:color="000000" w:themeColor="text1"/>
+              <w:right w:val="single" w:sz="4" w:space="0" w:color="000000" w:themeColor="text1"/>
+            </w:tcBorders>
+            <w:shd w:val="clear" w:color="auto" w:fill="D9D9D9" w:themeFill="background1" w:themeFillShade="D9"/>
+            <w:vAlign w:val="center"/>
+          </w:tcPr>
+          <w:p>
+            <w:pPr>
+              <w:spacing w:line="276" w:lineRule="auto"/>
+              <w:jc w:val="center"/>
+              <w:rPr>
+                <w:color w:val="0E2841" w:themeColor="text2"/>
+                <w:sz w:val="32"/>
+                <w:szCs w:val="32"/>
+              </w:rPr>
+            </w:pPr>
+            <w:r>
+              <w:rPr>
+                <w:sz w:val="32"/>
+                <w:szCs w:val="32"/>
+              </w:rPr>
+              <w:lastRenderedPageBreak/>
+              <w:t>Ethical Matrix</w:t>
+            </w:r>
+            <w:r>
+              <w:rPr>
+                <w:sz w:val="32"/>
+                <w:szCs w:val="32"/>
+              </w:rPr>
+              <w:t xml:space="preserve">: </w:t>
+            </w:r>
+            <w:r>
+              <w:rPr>
+                <w:sz w:val="32"/>
+                <w:szCs w:val="32"/>
+              </w:rPr>
+              <w:t>BMI</w:t>
+            </w:r>
+            <w:r>
+              <w:rPr>
+                <w:sz w:val="32"/>
+                <w:szCs w:val="32"/>
+              </w:rPr>
+              <w:t xml:space="preserve"> + AI Tax</w:t>
+            </w:r>
+          </w:p>
+        </w:tc>
+        <w:tc>
+          <w:tcPr>
+            <w:tcW w:w="2160" w:type="dxa"/>
+            <w:tcBorders>
+              <w:top w:val="single" w:sz="4" w:space="0" w:color="000000" w:themeColor="text1"/>
+              <w:bottom w:val="single" w:sz="4" w:space="0" w:color="000000" w:themeColor="text1"/>
+              <w:right w:val="single" w:sz="4" w:space="0" w:color="000000" w:themeColor="text1"/>
+            </w:tcBorders>
+            <w:shd w:val="clear" w:color="auto" w:fill="FAE2D5" w:themeFill="accent2" w:themeFillTint="33"/>
+            <w:vAlign w:val="center"/>
+          </w:tcPr>
+          <w:p>
+            <w:pPr>
+              <w:spacing w:line="276" w:lineRule="auto"/>
+              <w:jc w:val="center"/>
+              <w:cnfStyle w:val="100000000000" w:firstRow="1" w:lastRow="0" w:firstColumn="0" w:lastColumn="0" w:oddVBand="0" w:evenVBand="0" w:oddHBand="0" w:evenHBand="0" w:firstRowFirstColumn="0" w:firstRowLastColumn="0" w:lastRowFirstColumn="0" w:lastRowLastColumn="0"/>
+              <w:rPr>
+                <w:b w:val="0"/>
+                <w:bCs w:val="0"/>
+                <w:color w:val="0E2841" w:themeColor="text2"/>
+              </w:rPr>
+            </w:pPr>
+            <w:r>
+              <w:rPr>
+                <w:color w:val="0E2841" w:themeColor="text2"/>
+              </w:rPr>
+              <w:t>Government</w:t>
+            </w:r>
+          </w:p>
+        </w:tc>
+        <w:tc>
+          <w:tcPr>
+            <w:tcW w:w="2106" w:type="dxa"/>
+            <w:gridSpan w:val="2"/>
+            <w:tcBorders>
+              <w:top w:val="single" w:sz="4" w:space="0" w:color="000000" w:themeColor="text1"/>
+              <w:bottom w:val="single" w:sz="4" w:space="0" w:color="000000" w:themeColor="text1"/>
+              <w:right w:val="single" w:sz="4" w:space="0" w:color="000000" w:themeColor="text1"/>
+            </w:tcBorders>
+            <w:shd w:val="clear" w:color="auto" w:fill="FAE2D5" w:themeFill="accent2" w:themeFillTint="33"/>
+            <w:vAlign w:val="center"/>
+          </w:tcPr>
+          <w:p>
+            <w:pPr>
+              <w:spacing w:line="276" w:lineRule="auto"/>
+              <w:jc w:val="center"/>
+              <w:cnfStyle w:val="100000000000" w:firstRow="1" w:lastRow="0" w:firstColumn="0" w:lastColumn="0" w:oddVBand="0" w:evenVBand="0" w:oddHBand="0" w:evenHBand="0" w:firstRowFirstColumn="0" w:firstRowLastColumn="0" w:lastRowFirstColumn="0" w:lastRowLastColumn="0"/>
+              <w:rPr>
+                <w:b w:val="0"/>
+                <w:bCs w:val="0"/>
+                <w:color w:val="0E2841" w:themeColor="text2"/>
+              </w:rPr>
+            </w:pPr>
+            <w:r>
+              <w:rPr>
+                <w:color w:val="0E2841" w:themeColor="text2"/>
+              </w:rPr>
+              <w:t>Individuals Who Lost Job To AI</w:t>
+            </w:r>
+          </w:p>
+        </w:tc>
+      </w:tr>
+      <w:tr>
+        <w:trPr>
+          <w:gridAfter w:val="1"/>
+          <w:wAfter w:w="36" w:type="dxa"/>
+          <w:trHeight w:val="1941"/>
+        </w:trPr>
+        <w:tc>
+          <w:tcPr>
+            <w:cnfStyle w:val="001000000000" w:firstRow="0" w:lastRow="0" w:firstColumn="1" w:lastColumn="0" w:oddVBand="0" w:evenVBand="0" w:oddHBand="0" w:evenHBand="0" w:firstRowFirstColumn="0" w:firstRowLastColumn="0" w:lastRowFirstColumn="0" w:lastRowLastColumn="0"/>
+            <w:tcW w:w="5215" w:type="dxa"/>
+            <w:tcBorders>
+              <w:top w:val="single" w:sz="4" w:space="0" w:color="000000" w:themeColor="text1"/>
+              <w:left w:val="single" w:sz="4" w:space="0" w:color="000000" w:themeColor="text1"/>
+              <w:bottom w:val="single" w:sz="4" w:space="0" w:color="000000" w:themeColor="text1"/>
+              <w:right w:val="single" w:sz="4" w:space="0" w:color="000000" w:themeColor="text1"/>
+            </w:tcBorders>
+            <w:shd w:val="clear" w:color="auto" w:fill="F2F2F2" w:themeFill="background1" w:themeFillShade="F2"/>
+          </w:tcPr>
+          <w:p>
+            <w:pPr>
+              <w:spacing w:line="276" w:lineRule="auto"/>
+              <w:rPr>
+                <w:color w:val="0E2841" w:themeColor="text2"/>
+              </w:rPr>
+            </w:pPr>
+            <w:r>
+              <w:rPr>
+                <w:color w:val="0E2841" w:themeColor="text2"/>
+                <w:sz w:val="20"/>
+                <w:szCs w:val="20"/>
+              </w:rPr>
+              <w:t>•</w:t>
+            </w:r>
+            <w:r>
+              <w:rPr>
+                <w:color w:val="0E2841" w:themeColor="text2"/>
+                <w:sz w:val="22"/>
+                <w:szCs w:val="22"/>
+              </w:rPr>
+              <w:t xml:space="preserve"> How will each stakeholder benefit?</w:t>
+            </w:r>
+            <w:r>
+              <w:rPr>
+                <w:color w:val="0E2841" w:themeColor="text2"/>
+                <w:sz w:val="22"/>
+                <w:szCs w:val="22"/>
+              </w:rPr>
+              <w:br/>
+              <w:t xml:space="preserve">• </w:t>
+            </w:r>
+            <w:r>
+              <w:rPr>
+                <w:color w:val="7F7F7F" w:themeColor="text1" w:themeTint="80"/>
+                <w:sz w:val="22"/>
+                <w:szCs w:val="22"/>
+              </w:rPr>
+              <w:t>How might they each be harmed?</w:t>
+            </w:r>
+            <w:r>
+              <w:rPr>
+                <w:color w:val="7F7F7F" w:themeColor="text1" w:themeTint="80"/>
+                <w:sz w:val="22"/>
+                <w:szCs w:val="22"/>
+              </w:rPr>
+              <w:br/>
+            </w:r>
+            <w:r>
+              <w:rPr>
+                <w:color w:val="0E2841" w:themeColor="text2"/>
+                <w:sz w:val="22"/>
+                <w:szCs w:val="22"/>
+              </w:rPr>
+              <w:t>• Are there less risky alternatives that could provide the same outcome?</w:t>
+            </w:r>
+          </w:p>
+        </w:tc>
+        <w:tc>
+          <w:tcPr>
+            <w:tcW w:w="2160" w:type="dxa"/>
+            <w:tcBorders>
+              <w:top w:val="single" w:sz="4" w:space="0" w:color="000000" w:themeColor="text1"/>
+              <w:left w:val="single" w:sz="4" w:space="0" w:color="000000" w:themeColor="text1"/>
+              <w:bottom w:val="single" w:sz="4" w:space="0" w:color="000000" w:themeColor="text1"/>
+              <w:right w:val="single" w:sz="4" w:space="0" w:color="000000" w:themeColor="text1"/>
+            </w:tcBorders>
+            <w:shd w:val="clear" w:color="auto" w:fill="F2F2F2" w:themeFill="background1" w:themeFillShade="F2"/>
+          </w:tcPr>
+          <w:p>
+            <w:pPr>
+              <w:pStyle w:val="ListParagraph"/>
+              <w:numPr>
+                <w:ilvl w:val="0"/>
+                <w:numId w:val="6"/>
+              </w:numPr>
+              <w:spacing w:line="276" w:lineRule="auto"/>
+              <w:cnfStyle w:val="000000000000" w:firstRow="0" w:lastRow="0" w:firstColumn="0" w:lastColumn="0" w:oddVBand="0" w:evenVBand="0" w:oddHBand="0" w:evenHBand="0" w:firstRowFirstColumn="0" w:firstRowLastColumn="0" w:lastRowFirstColumn="0" w:lastRowLastColumn="0"/>
+              <w:rPr>
+                <w:b/>
+                <w:bCs/>
+                <w:sz w:val="20"/>
+                <w:szCs w:val="20"/>
+              </w:rPr>
+            </w:pPr>
+            <w:r>
+              <w:rPr>
+                <w:b/>
+                <w:bCs/>
+                <w:noProof/>
+              </w:rPr>
+              <w:drawing>
+                <wp:anchor distT="0" distB="0" distL="114300" distR="114300" simplePos="0" relativeHeight="251667456" behindDoc="0" locked="0" layoutInCell="1" allowOverlap="1" wp14:anchorId="558AC7F5" wp14:editId="69D6CA43">
+                  <wp:simplePos x="0" y="0"/>
+                  <wp:positionH relativeFrom="column">
+                    <wp:posOffset>-66039</wp:posOffset>
+                  </wp:positionH>
+                  <wp:positionV relativeFrom="paragraph">
+                    <wp:posOffset>-10160</wp:posOffset>
+                  </wp:positionV>
+                  <wp:extent cx="1371600" cy="1495425"/>
+                  <wp:effectExtent l="0" t="0" r="0" b="9525"/>
+                  <wp:wrapNone/>
+                  <wp:docPr id="1014364692" name="Picture 1"/>
+                  <wp:cNvGraphicFramePr>
+                    <a:graphicFrameLocks xmlns:a="http://schemas.openxmlformats.org/drawingml/2006/main" noChangeAspect="1"/>
+                  </wp:cNvGraphicFramePr>
+                  <a:graphic xmlns:a="http://schemas.openxmlformats.org/drawingml/2006/main">
+                    <a:graphicData uri="http://schemas.openxmlformats.org/drawingml/2006/picture">
+                      <pic:pic xmlns:pic="http://schemas.openxmlformats.org/drawingml/2006/picture">
+                        <pic:nvPicPr>
+                          <pic:cNvPr id="2051413730" name=""/>
+                          <pic:cNvPicPr/>
+                        </pic:nvPicPr>
+                        <pic:blipFill>
+                          <a:blip r:embed="rId12">
+                            <a:alphaModFix amt="50000"/>
+                            <a:extLst>
+                              <a:ext uri="{28A0092B-C50C-407E-A947-70E740481C1C}">
+                                <a14:useLocalDpi xmlns:a14="http://schemas.microsoft.com/office/drawing/2010/main" val="0"/>
+                              </a:ext>
+                            </a:extLst>
+                          </a:blip>
+                          <a:stretch>
+                            <a:fillRect/>
+                          </a:stretch>
+                        </pic:blipFill>
+                        <pic:spPr>
+                          <a:xfrm>
+                            <a:off x="0" y="0"/>
+                            <a:ext cx="1371600" cy="1495425"/>
+                          </a:xfrm>
+                          <a:prstGeom prst="rect">
+                            <a:avLst/>
+                          </a:prstGeom>
+                        </pic:spPr>
+                      </pic:pic>
+                    </a:graphicData>
+                  </a:graphic>
+                  <wp14:sizeRelH relativeFrom="margin">
+                    <wp14:pctWidth>0</wp14:pctWidth>
+                  </wp14:sizeRelH>
+                  <wp14:sizeRelV relativeFrom="margin">
+                    <wp14:pctHeight>0</wp14:pctHeight>
+                  </wp14:sizeRelV>
+                </wp:anchor>
+              </w:drawing>
+            </w:r>
+            <w:r>
+              <w:rPr>
+                <w:b/>
+                <w:bCs/>
+                <w:sz w:val="20"/>
+                <w:szCs w:val="20"/>
+              </w:rPr>
+              <w:t>Increased tax on businesses</w:t>
+            </w:r>
+          </w:p>
+          <w:p>
+            <w:pPr>
+              <w:pStyle w:val="ListParagraph"/>
+              <w:numPr>
+                <w:ilvl w:val="0"/>
+                <w:numId w:val="6"/>
+              </w:numPr>
+              <w:spacing w:line="276" w:lineRule="auto"/>
+              <w:cnfStyle w:val="000000000000" w:firstRow="0" w:lastRow="0" w:firstColumn="0" w:lastColumn="0" w:oddVBand="0" w:evenVBand="0" w:oddHBand="0" w:evenHBand="0" w:firstRowFirstColumn="0" w:firstRowLastColumn="0" w:lastRowFirstColumn="0" w:lastRowLastColumn="0"/>
+              <w:rPr>
+                <w:b/>
+                <w:bCs/>
+                <w:sz w:val="20"/>
+                <w:szCs w:val="20"/>
+              </w:rPr>
+            </w:pPr>
+            <w:r>
+              <w:rPr>
+                <w:b/>
+                <w:bCs/>
+                <w:sz w:val="20"/>
+                <w:szCs w:val="20"/>
+              </w:rPr>
+              <w:t>Increased burden on social service infra.</w:t>
+            </w:r>
+          </w:p>
+          <w:p>
+            <w:pPr>
+              <w:pStyle w:val="ListParagraph"/>
+              <w:numPr>
+                <w:ilvl w:val="0"/>
+                <w:numId w:val="6"/>
+              </w:numPr>
+              <w:spacing w:line="276" w:lineRule="auto"/>
+              <w:cnfStyle w:val="000000000000" w:firstRow="0" w:lastRow="0" w:firstColumn="0" w:lastColumn="0" w:oddVBand="0" w:evenVBand="0" w:oddHBand="0" w:evenHBand="0" w:firstRowFirstColumn="0" w:firstRowLastColumn="0" w:lastRowFirstColumn="0" w:lastRowLastColumn="0"/>
+              <w:rPr>
+                <w:b/>
+                <w:bCs/>
+                <w:sz w:val="20"/>
+                <w:szCs w:val="20"/>
+              </w:rPr>
+            </w:pPr>
+            <w:r>
+              <w:rPr>
+                <w:b/>
+                <w:bCs/>
+                <w:sz w:val="20"/>
+                <w:szCs w:val="20"/>
+              </w:rPr>
+              <w:t>Strict AI-employment legislation</w:t>
+            </w:r>
+          </w:p>
+        </w:tc>
+        <w:tc>
+          <w:tcPr>
+            <w:tcW w:w="2070" w:type="dxa"/>
+            <w:tcBorders>
+              <w:top w:val="single" w:sz="4" w:space="0" w:color="000000" w:themeColor="text1"/>
+              <w:left w:val="single" w:sz="4" w:space="0" w:color="000000" w:themeColor="text1"/>
+              <w:bottom w:val="single" w:sz="4" w:space="0" w:color="000000" w:themeColor="text1"/>
+              <w:right w:val="single" w:sz="4" w:space="0" w:color="000000" w:themeColor="text1"/>
+            </w:tcBorders>
+            <w:shd w:val="clear" w:color="auto" w:fill="F2F2F2" w:themeFill="background1" w:themeFillShade="F2"/>
+          </w:tcPr>
+          <w:p>
+            <w:pPr>
+              <w:pStyle w:val="ListParagraph"/>
+              <w:numPr>
+                <w:ilvl w:val="0"/>
+                <w:numId w:val="6"/>
+              </w:numPr>
+              <w:spacing w:line="276" w:lineRule="auto"/>
+              <w:cnfStyle w:val="000000000000" w:firstRow="0" w:lastRow="0" w:firstColumn="0" w:lastColumn="0" w:oddVBand="0" w:evenVBand="0" w:oddHBand="0" w:evenHBand="0" w:firstRowFirstColumn="0" w:firstRowLastColumn="0" w:lastRowFirstColumn="0" w:lastRowLastColumn="0"/>
+              <w:rPr>
+                <w:b/>
+                <w:bCs/>
+                <w:sz w:val="20"/>
+                <w:szCs w:val="20"/>
+              </w:rPr>
+            </w:pPr>
+            <w:r>
+              <w:rPr>
+                <w:noProof/>
+              </w:rPr>
+              <w:drawing>
+                <wp:anchor distT="0" distB="0" distL="114300" distR="114300" simplePos="0" relativeHeight="251668480" behindDoc="0" locked="0" layoutInCell="1" allowOverlap="1" wp14:anchorId="6FF9B8EE" wp14:editId="4E437520">
+                  <wp:simplePos x="0" y="0"/>
+                  <wp:positionH relativeFrom="column">
+                    <wp:posOffset>-50800</wp:posOffset>
+                  </wp:positionH>
+                  <wp:positionV relativeFrom="paragraph">
+                    <wp:posOffset>-10161</wp:posOffset>
+                  </wp:positionV>
+                  <wp:extent cx="1256665" cy="1495425"/>
+                  <wp:effectExtent l="0" t="0" r="635" b="9525"/>
+                  <wp:wrapNone/>
+                  <wp:docPr id="599930967" name="Picture 1"/>
+                  <wp:cNvGraphicFramePr>
+                    <a:graphicFrameLocks xmlns:a="http://schemas.openxmlformats.org/drawingml/2006/main" noChangeAspect="1"/>
+                  </wp:cNvGraphicFramePr>
+                  <a:graphic xmlns:a="http://schemas.openxmlformats.org/drawingml/2006/main">
+                    <a:graphicData uri="http://schemas.openxmlformats.org/drawingml/2006/picture">
+                      <pic:pic xmlns:pic="http://schemas.openxmlformats.org/drawingml/2006/picture">
+                        <pic:nvPicPr>
+                          <pic:cNvPr id="428446694" name=""/>
+                          <pic:cNvPicPr/>
+                        </pic:nvPicPr>
+                        <pic:blipFill>
+                          <a:blip r:embed="rId13">
+                            <a:alphaModFix amt="50000"/>
+                            <a:extLst>
+                              <a:ext uri="{28A0092B-C50C-407E-A947-70E740481C1C}">
+                                <a14:useLocalDpi xmlns:a14="http://schemas.microsoft.com/office/drawing/2010/main" val="0"/>
+                              </a:ext>
+                            </a:extLst>
+                          </a:blip>
+                          <a:stretch>
+                            <a:fillRect/>
+                          </a:stretch>
+                        </pic:blipFill>
+                        <pic:spPr>
+                          <a:xfrm>
+                            <a:off x="0" y="0"/>
+                            <a:ext cx="1256665" cy="1495425"/>
+                          </a:xfrm>
+                          <a:prstGeom prst="rect">
+                            <a:avLst/>
+                          </a:prstGeom>
+                        </pic:spPr>
+                      </pic:pic>
+                    </a:graphicData>
+                  </a:graphic>
+                  <wp14:sizeRelH relativeFrom="margin">
+                    <wp14:pctWidth>0</wp14:pctWidth>
+                  </wp14:sizeRelH>
+                  <wp14:sizeRelV relativeFrom="margin">
+                    <wp14:pctHeight>0</wp14:pctHeight>
+                  </wp14:sizeRelV>
+                </wp:anchor>
+              </w:drawing>
+            </w:r>
+            <w:r>
+              <w:rPr>
+                <w:b/>
+                <w:bCs/>
+                <w:sz w:val="20"/>
+                <w:szCs w:val="20"/>
+              </w:rPr>
+              <w:t>Compensated for lost work</w:t>
+            </w:r>
+          </w:p>
+          <w:p>
+            <w:pPr>
+              <w:pStyle w:val="ListParagraph"/>
+              <w:numPr>
+                <w:ilvl w:val="0"/>
+                <w:numId w:val="6"/>
+              </w:numPr>
+              <w:spacing w:line="276" w:lineRule="auto"/>
+              <w:cnfStyle w:val="000000000000" w:firstRow="0" w:lastRow="0" w:firstColumn="0" w:lastColumn="0" w:oddVBand="0" w:evenVBand="0" w:oddHBand="0" w:evenHBand="0" w:firstRowFirstColumn="0" w:firstRowLastColumn="0" w:lastRowFirstColumn="0" w:lastRowLastColumn="0"/>
+              <w:rPr>
+                <w:b/>
+                <w:bCs/>
+                <w:sz w:val="20"/>
+                <w:szCs w:val="20"/>
+              </w:rPr>
+            </w:pPr>
+            <w:r>
+              <w:rPr>
+                <w:b/>
+                <w:bCs/>
+                <w:sz w:val="20"/>
+                <w:szCs w:val="20"/>
+              </w:rPr>
+              <w:t>Lack of drive/opportunity</w:t>
+            </w:r>
+          </w:p>
+          <w:p>
+            <w:pPr>
+              <w:pStyle w:val="ListParagraph"/>
+              <w:numPr>
+                <w:ilvl w:val="0"/>
+                <w:numId w:val="6"/>
+              </w:numPr>
+              <w:spacing w:line="276" w:lineRule="auto"/>
+              <w:cnfStyle w:val="000000000000" w:firstRow="0" w:lastRow="0" w:firstColumn="0" w:lastColumn="0" w:oddVBand="0" w:evenVBand="0" w:oddHBand="0" w:evenHBand="0" w:firstRowFirstColumn="0" w:firstRowLastColumn="0" w:lastRowFirstColumn="0" w:lastRowLastColumn="0"/>
+              <w:rPr>
+                <w:b/>
+                <w:bCs/>
+                <w:sz w:val="22"/>
+                <w:szCs w:val="22"/>
+              </w:rPr>
+            </w:pPr>
+            <w:r>
+              <w:rPr>
+                <w:b/>
+                <w:bCs/>
+                <w:sz w:val="20"/>
+                <w:szCs w:val="20"/>
+              </w:rPr>
+              <w:t>Retrain in AI-related field</w:t>
+            </w:r>
+          </w:p>
+        </w:tc>
+      </w:tr>
+      <w:tr>
+        <w:trPr>
+          <w:gridAfter w:val="1"/>
+          <w:wAfter w:w="36" w:type="dxa"/>
+          <w:trHeight w:val="2274"/>
+        </w:trPr>
+        <w:tc>
+          <w:tcPr>
+            <w:cnfStyle w:val="001000000000" w:firstRow="0" w:lastRow="0" w:firstColumn="1" w:lastColumn="0" w:oddVBand="0" w:evenVBand="0" w:oddHBand="0" w:evenHBand="0" w:firstRowFirstColumn="0" w:firstRowLastColumn="0" w:lastRowFirstColumn="0" w:lastRowLastColumn="0"/>
+            <w:tcW w:w="5215" w:type="dxa"/>
+            <w:tcBorders>
+              <w:top w:val="single" w:sz="4" w:space="0" w:color="000000" w:themeColor="text1"/>
+              <w:left w:val="single" w:sz="4" w:space="0" w:color="000000" w:themeColor="text1"/>
+              <w:bottom w:val="single" w:sz="4" w:space="0" w:color="000000" w:themeColor="text1"/>
+              <w:right w:val="single" w:sz="4" w:space="0" w:color="000000" w:themeColor="text1"/>
+            </w:tcBorders>
+            <w:shd w:val="clear" w:color="auto" w:fill="F2F2F2" w:themeFill="background1" w:themeFillShade="F2"/>
+          </w:tcPr>
+          <w:p>
+            <w:pPr>
+              <w:spacing w:line="276" w:lineRule="auto"/>
+              <w:rPr>
+                <w:color w:val="0E2841" w:themeColor="text2"/>
+              </w:rPr>
+            </w:pPr>
+            <w:r>
+              <w:rPr>
+                <w:color w:val="0E2841" w:themeColor="text2"/>
+                <w:sz w:val="20"/>
+                <w:szCs w:val="20"/>
+              </w:rPr>
+              <w:t xml:space="preserve">• </w:t>
+            </w:r>
+            <w:r>
+              <w:rPr>
+                <w:color w:val="7F7F7F" w:themeColor="text1" w:themeTint="80"/>
+                <w:sz w:val="22"/>
+                <w:szCs w:val="22"/>
+              </w:rPr>
+              <w:t>Will each stakeholder have a choice to use or be subject of the use?</w:t>
+            </w:r>
+            <w:r>
+              <w:rPr>
+                <w:color w:val="0E2841" w:themeColor="text2"/>
+                <w:sz w:val="22"/>
+                <w:szCs w:val="22"/>
+              </w:rPr>
+              <w:br/>
+              <w:t>• Will they be able to determine how it is used with respect to their interests?</w:t>
+            </w:r>
+            <w:r>
+              <w:rPr>
+                <w:color w:val="0E2841" w:themeColor="text2"/>
+                <w:sz w:val="22"/>
+                <w:szCs w:val="22"/>
+              </w:rPr>
+              <w:br/>
+              <w:t xml:space="preserve">• </w:t>
+            </w:r>
+            <w:r>
+              <w:rPr>
+                <w:color w:val="7F7F7F" w:themeColor="text1" w:themeTint="80"/>
+                <w:sz w:val="22"/>
+                <w:szCs w:val="22"/>
+              </w:rPr>
+              <w:t>What</w:t>
+            </w:r>
+            <w:r>
+              <w:rPr>
+                <w:color w:val="0E2841" w:themeColor="text2"/>
+                <w:sz w:val="22"/>
+                <w:szCs w:val="22"/>
+              </w:rPr>
+              <w:t xml:space="preserve"> </w:t>
+            </w:r>
+            <w:r>
+              <w:rPr>
+                <w:color w:val="7F7F7F" w:themeColor="text1" w:themeTint="80"/>
+                <w:sz w:val="22"/>
+                <w:szCs w:val="22"/>
+              </w:rPr>
+              <w:t>will informed consent look like?</w:t>
+            </w:r>
+          </w:p>
+        </w:tc>
+        <w:tc>
+          <w:tcPr>
+            <w:tcW w:w="2160" w:type="dxa"/>
+            <w:tcBorders>
+              <w:top w:val="single" w:sz="4" w:space="0" w:color="000000" w:themeColor="text1"/>
+              <w:left w:val="single" w:sz="4" w:space="0" w:color="000000" w:themeColor="text1"/>
+              <w:bottom w:val="single" w:sz="4" w:space="0" w:color="000000" w:themeColor="text1"/>
+              <w:right w:val="single" w:sz="4" w:space="0" w:color="000000" w:themeColor="text1"/>
+            </w:tcBorders>
+            <w:shd w:val="clear" w:color="auto" w:fill="F2F2F2" w:themeFill="background1" w:themeFillShade="F2"/>
+          </w:tcPr>
+          <w:p>
+            <w:pPr>
+              <w:pStyle w:val="ListParagraph"/>
+              <w:numPr>
+                <w:ilvl w:val="0"/>
+                <w:numId w:val="6"/>
+              </w:numPr>
+              <w:spacing w:line="276" w:lineRule="auto"/>
+              <w:cnfStyle w:val="000000000000" w:firstRow="0" w:lastRow="0" w:firstColumn="0" w:lastColumn="0" w:oddVBand="0" w:evenVBand="0" w:oddHBand="0" w:evenHBand="0" w:firstRowFirstColumn="0" w:firstRowLastColumn="0" w:lastRowFirstColumn="0" w:lastRowLastColumn="0"/>
+              <w:rPr>
+                <w:b/>
+                <w:bCs/>
+                <w:sz w:val="20"/>
+                <w:szCs w:val="20"/>
+              </w:rPr>
+            </w:pPr>
+            <w:r>
+              <w:rPr>
+                <w:b/>
+                <w:bCs/>
+                <w:noProof/>
+              </w:rPr>
+              <w:drawing>
+                <wp:anchor distT="0" distB="0" distL="114300" distR="114300" simplePos="0" relativeHeight="251669504" behindDoc="0" locked="0" layoutInCell="1" allowOverlap="1" wp14:anchorId="440250A0" wp14:editId="3188CEC1">
+                  <wp:simplePos x="0" y="0"/>
+                  <wp:positionH relativeFrom="column">
+                    <wp:posOffset>-18415</wp:posOffset>
+                  </wp:positionH>
+                  <wp:positionV relativeFrom="paragraph">
+                    <wp:posOffset>-9525</wp:posOffset>
+                  </wp:positionV>
+                  <wp:extent cx="1323340" cy="1524000"/>
+                  <wp:effectExtent l="0" t="0" r="0" b="0"/>
+                  <wp:wrapNone/>
+                  <wp:docPr id="1412888599" name="Picture 1"/>
+                  <wp:cNvGraphicFramePr>
+                    <a:graphicFrameLocks xmlns:a="http://schemas.openxmlformats.org/drawingml/2006/main" noChangeAspect="1"/>
+                  </wp:cNvGraphicFramePr>
+                  <a:graphic xmlns:a="http://schemas.openxmlformats.org/drawingml/2006/main">
+                    <a:graphicData uri="http://schemas.openxmlformats.org/drawingml/2006/picture">
+                      <pic:pic xmlns:pic="http://schemas.openxmlformats.org/drawingml/2006/picture">
+                        <pic:nvPicPr>
+                          <pic:cNvPr id="1144994824" name=""/>
+                          <pic:cNvPicPr/>
+                        </pic:nvPicPr>
+                        <pic:blipFill>
+                          <a:blip r:embed="rId14">
+                            <a:alphaModFix amt="50000"/>
+                            <a:extLst>
+                              <a:ext uri="{28A0092B-C50C-407E-A947-70E740481C1C}">
+                                <a14:useLocalDpi xmlns:a14="http://schemas.microsoft.com/office/drawing/2010/main" val="0"/>
+                              </a:ext>
+                            </a:extLst>
+                          </a:blip>
+                          <a:stretch>
+                            <a:fillRect/>
+                          </a:stretch>
+                        </pic:blipFill>
+                        <pic:spPr>
+                          <a:xfrm>
+                            <a:off x="0" y="0"/>
+                            <a:ext cx="1323561" cy="1524255"/>
+                          </a:xfrm>
+                          <a:prstGeom prst="rect">
+                            <a:avLst/>
+                          </a:prstGeom>
+                        </pic:spPr>
+                      </pic:pic>
+                    </a:graphicData>
+                  </a:graphic>
+                  <wp14:sizeRelH relativeFrom="margin">
+                    <wp14:pctWidth>0</wp14:pctWidth>
+                  </wp14:sizeRelH>
+                  <wp14:sizeRelV relativeFrom="margin">
+                    <wp14:pctHeight>0</wp14:pctHeight>
+                  </wp14:sizeRelV>
+                </wp:anchor>
+              </w:drawing>
+            </w:r>
+            <w:r>
+              <w:rPr>
+                <w:b/>
+                <w:bCs/>
+                <w:sz w:val="20"/>
+                <w:szCs w:val="20"/>
+              </w:rPr>
+              <w:t>The government will have a choice</w:t>
+            </w:r>
+            <w:r>
+              <w:rPr>
+                <w:b/>
+                <w:bCs/>
+                <w:sz w:val="20"/>
+                <w:szCs w:val="20"/>
+              </w:rPr>
+              <w:t xml:space="preserve"> to not compensate workers</w:t>
+            </w:r>
+          </w:p>
+          <w:p>
+            <w:pPr>
+              <w:pStyle w:val="ListParagraph"/>
+              <w:numPr>
+                <w:ilvl w:val="0"/>
+                <w:numId w:val="6"/>
+              </w:numPr>
+              <w:spacing w:line="276" w:lineRule="auto"/>
+              <w:cnfStyle w:val="000000000000" w:firstRow="0" w:lastRow="0" w:firstColumn="0" w:lastColumn="0" w:oddVBand="0" w:evenVBand="0" w:oddHBand="0" w:evenHBand="0" w:firstRowFirstColumn="0" w:firstRowLastColumn="0" w:lastRowFirstColumn="0" w:lastRowLastColumn="0"/>
+              <w:rPr>
+                <w:b/>
+                <w:bCs/>
+                <w:sz w:val="20"/>
+                <w:szCs w:val="20"/>
+              </w:rPr>
+            </w:pPr>
+            <w:r>
+              <w:rPr>
+                <w:b/>
+                <w:bCs/>
+                <w:sz w:val="20"/>
+                <w:szCs w:val="20"/>
+              </w:rPr>
+              <w:t>TBD</w:t>
+            </w:r>
+          </w:p>
+          <w:p>
+            <w:pPr>
+              <w:pStyle w:val="ListParagraph"/>
+              <w:numPr>
+                <w:ilvl w:val="0"/>
+                <w:numId w:val="6"/>
+              </w:numPr>
+              <w:spacing w:line="276" w:lineRule="auto"/>
+              <w:cnfStyle w:val="000000000000" w:firstRow="0" w:lastRow="0" w:firstColumn="0" w:lastColumn="0" w:oddVBand="0" w:evenVBand="0" w:oddHBand="0" w:evenHBand="0" w:firstRowFirstColumn="0" w:firstRowLastColumn="0" w:lastRowFirstColumn="0" w:lastRowLastColumn="0"/>
+              <w:rPr>
+                <w:b/>
+                <w:bCs/>
+                <w:sz w:val="20"/>
+                <w:szCs w:val="20"/>
+              </w:rPr>
+            </w:pPr>
+            <w:r>
+              <w:rPr>
+                <w:b/>
+                <w:bCs/>
+                <w:sz w:val="20"/>
+                <w:szCs w:val="20"/>
+              </w:rPr>
+              <w:t>People will be begging for help</w:t>
+            </w:r>
+          </w:p>
+        </w:tc>
+        <w:tc>
+          <w:tcPr>
+            <w:tcW w:w="2070" w:type="dxa"/>
+            <w:tcBorders>
+              <w:top w:val="single" w:sz="4" w:space="0" w:color="000000" w:themeColor="text1"/>
+              <w:left w:val="single" w:sz="4" w:space="0" w:color="000000" w:themeColor="text1"/>
+              <w:bottom w:val="single" w:sz="4" w:space="0" w:color="000000" w:themeColor="text1"/>
+              <w:right w:val="single" w:sz="4" w:space="0" w:color="000000" w:themeColor="text1"/>
+            </w:tcBorders>
+            <w:shd w:val="clear" w:color="auto" w:fill="F2F2F2" w:themeFill="background1" w:themeFillShade="F2"/>
+          </w:tcPr>
+          <w:p>
+            <w:pPr>
+              <w:pStyle w:val="ListParagraph"/>
+              <w:numPr>
+                <w:ilvl w:val="0"/>
+                <w:numId w:val="6"/>
+              </w:numPr>
+              <w:spacing w:line="276" w:lineRule="auto"/>
+              <w:cnfStyle w:val="000000000000" w:firstRow="0" w:lastRow="0" w:firstColumn="0" w:lastColumn="0" w:oddVBand="0" w:evenVBand="0" w:oddHBand="0" w:evenHBand="0" w:firstRowFirstColumn="0" w:firstRowLastColumn="0" w:lastRowFirstColumn="0" w:lastRowLastColumn="0"/>
+              <w:rPr>
+                <w:b/>
+                <w:bCs/>
+                <w:sz w:val="20"/>
+                <w:szCs w:val="20"/>
+              </w:rPr>
+            </w:pPr>
+            <w:r>
+              <w:rPr>
+                <w:noProof/>
+              </w:rPr>
+              <w:drawing>
+                <wp:anchor distT="0" distB="0" distL="114300" distR="114300" simplePos="0" relativeHeight="251670528" behindDoc="0" locked="0" layoutInCell="1" allowOverlap="1" wp14:anchorId="3C1E1160" wp14:editId="665A8D45">
+                  <wp:simplePos x="0" y="0"/>
+                  <wp:positionH relativeFrom="column">
+                    <wp:posOffset>-50801</wp:posOffset>
+                  </wp:positionH>
+                  <wp:positionV relativeFrom="paragraph">
+                    <wp:posOffset>-9525</wp:posOffset>
+                  </wp:positionV>
+                  <wp:extent cx="1323975" cy="1460500"/>
+                  <wp:effectExtent l="0" t="0" r="9525" b="6350"/>
+                  <wp:wrapNone/>
+                  <wp:docPr id="538170272" name="Picture 1"/>
+                  <wp:cNvGraphicFramePr>
+                    <a:graphicFrameLocks xmlns:a="http://schemas.openxmlformats.org/drawingml/2006/main" noChangeAspect="1"/>
+                  </wp:cNvGraphicFramePr>
+                  <a:graphic xmlns:a="http://schemas.openxmlformats.org/drawingml/2006/main">
+                    <a:graphicData uri="http://schemas.openxmlformats.org/drawingml/2006/picture">
+                      <pic:pic xmlns:pic="http://schemas.openxmlformats.org/drawingml/2006/picture">
+                        <pic:nvPicPr>
+                          <pic:cNvPr id="1202944211" name=""/>
+                          <pic:cNvPicPr/>
+                        </pic:nvPicPr>
+                        <pic:blipFill rotWithShape="1">
+                          <a:blip r:embed="rId15">
+                            <a:alphaModFix amt="50000"/>
+                            <a:extLst>
+                              <a:ext uri="{28A0092B-C50C-407E-A947-70E740481C1C}">
+                                <a14:useLocalDpi xmlns:a14="http://schemas.microsoft.com/office/drawing/2010/main" val="0"/>
+                              </a:ext>
+                            </a:extLst>
+                          </a:blip>
+                          <a:srcRect t="8671"/>
+                          <a:stretch>
+                            <a:fillRect/>
+                          </a:stretch>
+                        </pic:blipFill>
+                        <pic:spPr bwMode="auto">
+                          <a:xfrm>
+                            <a:off x="0" y="0"/>
+                            <a:ext cx="1324026" cy="1460556"/>
+                          </a:xfrm>
+                          <a:prstGeom prst="rect">
+                            <a:avLst/>
+                          </a:prstGeom>
+                          <a:ln>
+                            <a:noFill/>
+                          </a:ln>
+                          <a:extLst>
+                            <a:ext uri="{53640926-AAD7-44D8-BBD7-CCE9431645EC}">
+                              <a14:shadowObscured xmlns:a14="http://schemas.microsoft.com/office/drawing/2010/main"/>
+                            </a:ext>
+                          </a:extLst>
+                        </pic:spPr>
+                      </pic:pic>
+                    </a:graphicData>
+                  </a:graphic>
+                  <wp14:sizeRelH relativeFrom="margin">
+                    <wp14:pctWidth>0</wp14:pctWidth>
+                  </wp14:sizeRelH>
+                  <wp14:sizeRelV relativeFrom="margin">
+                    <wp14:pctHeight>0</wp14:pctHeight>
+                  </wp14:sizeRelV>
+                </wp:anchor>
+              </w:drawing>
+            </w:r>
+            <w:r>
+              <w:rPr>
+                <w:b/>
+                <w:bCs/>
+                <w:sz w:val="20"/>
+                <w:szCs w:val="20"/>
+              </w:rPr>
+              <w:t>They could choose to retrain</w:t>
+            </w:r>
+          </w:p>
+          <w:p>
+            <w:pPr>
+              <w:pStyle w:val="ListParagraph"/>
+              <w:numPr>
+                <w:ilvl w:val="0"/>
+                <w:numId w:val="6"/>
+              </w:numPr>
+              <w:spacing w:line="276" w:lineRule="auto"/>
+              <w:cnfStyle w:val="000000000000" w:firstRow="0" w:lastRow="0" w:firstColumn="0" w:lastColumn="0" w:oddVBand="0" w:evenVBand="0" w:oddHBand="0" w:evenHBand="0" w:firstRowFirstColumn="0" w:firstRowLastColumn="0" w:lastRowFirstColumn="0" w:lastRowLastColumn="0"/>
+              <w:rPr>
+                <w:b/>
+                <w:bCs/>
+                <w:sz w:val="20"/>
+                <w:szCs w:val="20"/>
+              </w:rPr>
+            </w:pPr>
+            <w:r>
+              <w:rPr>
+                <w:b/>
+                <w:bCs/>
+                <w:sz w:val="20"/>
+                <w:szCs w:val="20"/>
+              </w:rPr>
+              <w:t>Not really</w:t>
+            </w:r>
+          </w:p>
+          <w:p>
+            <w:pPr>
+              <w:pStyle w:val="ListParagraph"/>
+              <w:numPr>
+                <w:ilvl w:val="0"/>
+                <w:numId w:val="6"/>
+              </w:numPr>
+              <w:spacing w:line="276" w:lineRule="auto"/>
+              <w:cnfStyle w:val="000000000000" w:firstRow="0" w:lastRow="0" w:firstColumn="0" w:lastColumn="0" w:oddVBand="0" w:evenVBand="0" w:oddHBand="0" w:evenHBand="0" w:firstRowFirstColumn="0" w:firstRowLastColumn="0" w:lastRowFirstColumn="0" w:lastRowLastColumn="0"/>
+              <w:rPr>
+                <w:b/>
+                <w:bCs/>
+                <w:sz w:val="22"/>
+                <w:szCs w:val="22"/>
+              </w:rPr>
+            </w:pPr>
+            <w:r>
+              <w:rPr>
+                <w:b/>
+                <w:bCs/>
+                <w:sz w:val="20"/>
+                <w:szCs w:val="20"/>
+              </w:rPr>
+              <w:t>TBD</w:t>
+            </w:r>
+          </w:p>
+        </w:tc>
+      </w:tr>
+    </w:tbl>
+    <w:p/>
+    <w:p/>
     <w:sectPr>
       <w:headerReference w:type="default" r:id="rId18"/>
       <w:pgSz w:w="12240" w:h="15840"/>
@@ -11650,6 +13353,119 @@
     </w:lvl>
   </w:abstractNum>
   <w:abstractNum w:abstractNumId="1" w15:restartNumberingAfterBreak="0">
+    <w:nsid w:val="0C2C268A"/>
+    <w:multiLevelType w:val="hybridMultilevel"/>
+    <w:tmpl w:val="AAF060DA"/>
+    <w:lvl w:ilvl="0" w:tplc="04090001">
+      <w:start w:val="1"/>
+      <w:numFmt w:val="bullet"/>
+      <w:lvlText w:val=""/>
+      <w:lvlJc w:val="left"/>
+      <w:pPr>
+        <w:ind w:left="360" w:hanging="360"/>
+      </w:pPr>
+      <w:rPr>
+        <w:rFonts w:ascii="Symbol" w:hAnsi="Symbol" w:hint="default"/>
+      </w:rPr>
+    </w:lvl>
+    <w:lvl w:ilvl="1" w:tplc="04090003">
+      <w:start w:val="1"/>
+      <w:numFmt w:val="bullet"/>
+      <w:lvlText w:val="o"/>
+      <w:lvlJc w:val="left"/>
+      <w:pPr>
+        <w:ind w:left="1080" w:hanging="360"/>
+      </w:pPr>
+      <w:rPr>
+        <w:rFonts w:ascii="Courier New" w:hAnsi="Courier New" w:cs="Courier New" w:hint="default"/>
+      </w:rPr>
+    </w:lvl>
+    <w:lvl w:ilvl="2" w:tplc="04090005" w:tentative="1">
+      <w:start w:val="1"/>
+      <w:numFmt w:val="bullet"/>
+      <w:lvlText w:val=""/>
+      <w:lvlJc w:val="left"/>
+      <w:pPr>
+        <w:ind w:left="1800" w:hanging="360"/>
+      </w:pPr>
+      <w:rPr>
+        <w:rFonts w:ascii="Wingdings" w:hAnsi="Wingdings" w:hint="default"/>
+      </w:rPr>
+    </w:lvl>
+    <w:lvl w:ilvl="3" w:tplc="04090001" w:tentative="1">
+      <w:start w:val="1"/>
+      <w:numFmt w:val="bullet"/>
+      <w:lvlText w:val=""/>
+      <w:lvlJc w:val="left"/>
+      <w:pPr>
+        <w:ind w:left="2520" w:hanging="360"/>
+      </w:pPr>
+      <w:rPr>
+        <w:rFonts w:ascii="Symbol" w:hAnsi="Symbol" w:hint="default"/>
+      </w:rPr>
+    </w:lvl>
+    <w:lvl w:ilvl="4" w:tplc="04090003" w:tentative="1">
+      <w:start w:val="1"/>
+      <w:numFmt w:val="bullet"/>
+      <w:lvlText w:val="o"/>
+      <w:lvlJc w:val="left"/>
+      <w:pPr>
+        <w:ind w:left="3240" w:hanging="360"/>
+      </w:pPr>
+      <w:rPr>
+        <w:rFonts w:ascii="Courier New" w:hAnsi="Courier New" w:cs="Courier New" w:hint="default"/>
+      </w:rPr>
+    </w:lvl>
+    <w:lvl w:ilvl="5" w:tplc="04090005" w:tentative="1">
+      <w:start w:val="1"/>
+      <w:numFmt w:val="bullet"/>
+      <w:lvlText w:val=""/>
+      <w:lvlJc w:val="left"/>
+      <w:pPr>
+        <w:ind w:left="3960" w:hanging="360"/>
+      </w:pPr>
+      <w:rPr>
+        <w:rFonts w:ascii="Wingdings" w:hAnsi="Wingdings" w:hint="default"/>
+      </w:rPr>
+    </w:lvl>
+    <w:lvl w:ilvl="6" w:tplc="04090001" w:tentative="1">
+      <w:start w:val="1"/>
+      <w:numFmt w:val="bullet"/>
+      <w:lvlText w:val=""/>
+      <w:lvlJc w:val="left"/>
+      <w:pPr>
+        <w:ind w:left="4680" w:hanging="360"/>
+      </w:pPr>
+      <w:rPr>
+        <w:rFonts w:ascii="Symbol" w:hAnsi="Symbol" w:hint="default"/>
+      </w:rPr>
+    </w:lvl>
+    <w:lvl w:ilvl="7" w:tplc="04090003" w:tentative="1">
+      <w:start w:val="1"/>
+      <w:numFmt w:val="bullet"/>
+      <w:lvlText w:val="o"/>
+      <w:lvlJc w:val="left"/>
+      <w:pPr>
+        <w:ind w:left="5400" w:hanging="360"/>
+      </w:pPr>
+      <w:rPr>
+        <w:rFonts w:ascii="Courier New" w:hAnsi="Courier New" w:cs="Courier New" w:hint="default"/>
+      </w:rPr>
+    </w:lvl>
+    <w:lvl w:ilvl="8" w:tplc="04090005" w:tentative="1">
+      <w:start w:val="1"/>
+      <w:numFmt w:val="bullet"/>
+      <w:lvlText w:val=""/>
+      <w:lvlJc w:val="left"/>
+      <w:pPr>
+        <w:ind w:left="6120" w:hanging="360"/>
+      </w:pPr>
+      <w:rPr>
+        <w:rFonts w:ascii="Wingdings" w:hAnsi="Wingdings" w:hint="default"/>
+      </w:rPr>
+    </w:lvl>
+  </w:abstractNum>
+  <w:abstractNum w:abstractNumId="2" w15:restartNumberingAfterBreak="0">
     <w:nsid w:val="182A49BA"/>
     <w:multiLevelType w:val="hybridMultilevel"/>
     <w:tmpl w:val="39A00DC0"/>
@@ -11762,7 +13578,7 @@
       </w:rPr>
     </w:lvl>
   </w:abstractNum>
-  <w:abstractNum w:abstractNumId="2" w15:restartNumberingAfterBreak="0">
+  <w:abstractNum w:abstractNumId="3" w15:restartNumberingAfterBreak="0">
     <w:nsid w:val="37E2183E"/>
     <w:multiLevelType w:val="hybridMultilevel"/>
     <w:tmpl w:val="89A63774"/>
@@ -11875,14 +13691,249 @@
       </w:rPr>
     </w:lvl>
   </w:abstractNum>
+  <w:abstractNum w:abstractNumId="4" w15:restartNumberingAfterBreak="0">
+    <w:nsid w:val="52F30347"/>
+    <w:multiLevelType w:val="hybridMultilevel"/>
+    <w:tmpl w:val="C44E7DF6"/>
+    <w:lvl w:ilvl="0" w:tplc="04090001">
+      <w:start w:val="1"/>
+      <w:numFmt w:val="bullet"/>
+      <w:lvlText w:val=""/>
+      <w:lvlJc w:val="left"/>
+      <w:pPr>
+        <w:ind w:left="360" w:hanging="360"/>
+      </w:pPr>
+      <w:rPr>
+        <w:rFonts w:ascii="Symbol" w:hAnsi="Symbol" w:hint="default"/>
+      </w:rPr>
+    </w:lvl>
+    <w:lvl w:ilvl="1" w:tplc="04090003">
+      <w:start w:val="1"/>
+      <w:numFmt w:val="bullet"/>
+      <w:lvlText w:val="o"/>
+      <w:lvlJc w:val="left"/>
+      <w:pPr>
+        <w:ind w:left="1080" w:hanging="360"/>
+      </w:pPr>
+      <w:rPr>
+        <w:rFonts w:ascii="Courier New" w:hAnsi="Courier New" w:cs="Courier New" w:hint="default"/>
+      </w:rPr>
+    </w:lvl>
+    <w:lvl w:ilvl="2" w:tplc="04090005" w:tentative="1">
+      <w:start w:val="1"/>
+      <w:numFmt w:val="bullet"/>
+      <w:lvlText w:val=""/>
+      <w:lvlJc w:val="left"/>
+      <w:pPr>
+        <w:ind w:left="1800" w:hanging="360"/>
+      </w:pPr>
+      <w:rPr>
+        <w:rFonts w:ascii="Wingdings" w:hAnsi="Wingdings" w:hint="default"/>
+      </w:rPr>
+    </w:lvl>
+    <w:lvl w:ilvl="3" w:tplc="04090001" w:tentative="1">
+      <w:start w:val="1"/>
+      <w:numFmt w:val="bullet"/>
+      <w:lvlText w:val=""/>
+      <w:lvlJc w:val="left"/>
+      <w:pPr>
+        <w:ind w:left="2520" w:hanging="360"/>
+      </w:pPr>
+      <w:rPr>
+        <w:rFonts w:ascii="Symbol" w:hAnsi="Symbol" w:hint="default"/>
+      </w:rPr>
+    </w:lvl>
+    <w:lvl w:ilvl="4" w:tplc="04090003" w:tentative="1">
+      <w:start w:val="1"/>
+      <w:numFmt w:val="bullet"/>
+      <w:lvlText w:val="o"/>
+      <w:lvlJc w:val="left"/>
+      <w:pPr>
+        <w:ind w:left="3240" w:hanging="360"/>
+      </w:pPr>
+      <w:rPr>
+        <w:rFonts w:ascii="Courier New" w:hAnsi="Courier New" w:cs="Courier New" w:hint="default"/>
+      </w:rPr>
+    </w:lvl>
+    <w:lvl w:ilvl="5" w:tplc="04090005" w:tentative="1">
+      <w:start w:val="1"/>
+      <w:numFmt w:val="bullet"/>
+      <w:lvlText w:val=""/>
+      <w:lvlJc w:val="left"/>
+      <w:pPr>
+        <w:ind w:left="3960" w:hanging="360"/>
+      </w:pPr>
+      <w:rPr>
+        <w:rFonts w:ascii="Wingdings" w:hAnsi="Wingdings" w:hint="default"/>
+      </w:rPr>
+    </w:lvl>
+    <w:lvl w:ilvl="6" w:tplc="04090001" w:tentative="1">
+      <w:start w:val="1"/>
+      <w:numFmt w:val="bullet"/>
+      <w:lvlText w:val=""/>
+      <w:lvlJc w:val="left"/>
+      <w:pPr>
+        <w:ind w:left="4680" w:hanging="360"/>
+      </w:pPr>
+      <w:rPr>
+        <w:rFonts w:ascii="Symbol" w:hAnsi="Symbol" w:hint="default"/>
+      </w:rPr>
+    </w:lvl>
+    <w:lvl w:ilvl="7" w:tplc="04090003" w:tentative="1">
+      <w:start w:val="1"/>
+      <w:numFmt w:val="bullet"/>
+      <w:lvlText w:val="o"/>
+      <w:lvlJc w:val="left"/>
+      <w:pPr>
+        <w:ind w:left="5400" w:hanging="360"/>
+      </w:pPr>
+      <w:rPr>
+        <w:rFonts w:ascii="Courier New" w:hAnsi="Courier New" w:cs="Courier New" w:hint="default"/>
+      </w:rPr>
+    </w:lvl>
+    <w:lvl w:ilvl="8" w:tplc="04090005" w:tentative="1">
+      <w:start w:val="1"/>
+      <w:numFmt w:val="bullet"/>
+      <w:lvlText w:val=""/>
+      <w:lvlJc w:val="left"/>
+      <w:pPr>
+        <w:ind w:left="6120" w:hanging="360"/>
+      </w:pPr>
+      <w:rPr>
+        <w:rFonts w:ascii="Wingdings" w:hAnsi="Wingdings" w:hint="default"/>
+      </w:rPr>
+    </w:lvl>
+  </w:abstractNum>
+  <w:abstractNum w:abstractNumId="5" w15:restartNumberingAfterBreak="0">
+    <w:nsid w:val="6810022E"/>
+    <w:multiLevelType w:val="hybridMultilevel"/>
+    <w:tmpl w:val="B298E3E6"/>
+    <w:lvl w:ilvl="0" w:tplc="04090001">
+      <w:start w:val="1"/>
+      <w:numFmt w:val="bullet"/>
+      <w:lvlText w:val=""/>
+      <w:lvlJc w:val="left"/>
+      <w:pPr>
+        <w:ind w:left="360" w:hanging="360"/>
+      </w:pPr>
+      <w:rPr>
+        <w:rFonts w:ascii="Symbol" w:hAnsi="Symbol" w:hint="default"/>
+      </w:rPr>
+    </w:lvl>
+    <w:lvl w:ilvl="1" w:tplc="04090003" w:tentative="1">
+      <w:start w:val="1"/>
+      <w:numFmt w:val="bullet"/>
+      <w:lvlText w:val="o"/>
+      <w:lvlJc w:val="left"/>
+      <w:pPr>
+        <w:ind w:left="1080" w:hanging="360"/>
+      </w:pPr>
+      <w:rPr>
+        <w:rFonts w:ascii="Courier New" w:hAnsi="Courier New" w:cs="Courier New" w:hint="default"/>
+      </w:rPr>
+    </w:lvl>
+    <w:lvl w:ilvl="2" w:tplc="04090005" w:tentative="1">
+      <w:start w:val="1"/>
+      <w:numFmt w:val="bullet"/>
+      <w:lvlText w:val=""/>
+      <w:lvlJc w:val="left"/>
+      <w:pPr>
+        <w:ind w:left="1800" w:hanging="360"/>
+      </w:pPr>
+      <w:rPr>
+        <w:rFonts w:ascii="Wingdings" w:hAnsi="Wingdings" w:hint="default"/>
+      </w:rPr>
+    </w:lvl>
+    <w:lvl w:ilvl="3" w:tplc="04090001" w:tentative="1">
+      <w:start w:val="1"/>
+      <w:numFmt w:val="bullet"/>
+      <w:lvlText w:val=""/>
+      <w:lvlJc w:val="left"/>
+      <w:pPr>
+        <w:ind w:left="2520" w:hanging="360"/>
+      </w:pPr>
+      <w:rPr>
+        <w:rFonts w:ascii="Symbol" w:hAnsi="Symbol" w:hint="default"/>
+      </w:rPr>
+    </w:lvl>
+    <w:lvl w:ilvl="4" w:tplc="04090003" w:tentative="1">
+      <w:start w:val="1"/>
+      <w:numFmt w:val="bullet"/>
+      <w:lvlText w:val="o"/>
+      <w:lvlJc w:val="left"/>
+      <w:pPr>
+        <w:ind w:left="3240" w:hanging="360"/>
+      </w:pPr>
+      <w:rPr>
+        <w:rFonts w:ascii="Courier New" w:hAnsi="Courier New" w:cs="Courier New" w:hint="default"/>
+      </w:rPr>
+    </w:lvl>
+    <w:lvl w:ilvl="5" w:tplc="04090005" w:tentative="1">
+      <w:start w:val="1"/>
+      <w:numFmt w:val="bullet"/>
+      <w:lvlText w:val=""/>
+      <w:lvlJc w:val="left"/>
+      <w:pPr>
+        <w:ind w:left="3960" w:hanging="360"/>
+      </w:pPr>
+      <w:rPr>
+        <w:rFonts w:ascii="Wingdings" w:hAnsi="Wingdings" w:hint="default"/>
+      </w:rPr>
+    </w:lvl>
+    <w:lvl w:ilvl="6" w:tplc="04090001" w:tentative="1">
+      <w:start w:val="1"/>
+      <w:numFmt w:val="bullet"/>
+      <w:lvlText w:val=""/>
+      <w:lvlJc w:val="left"/>
+      <w:pPr>
+        <w:ind w:left="4680" w:hanging="360"/>
+      </w:pPr>
+      <w:rPr>
+        <w:rFonts w:ascii="Symbol" w:hAnsi="Symbol" w:hint="default"/>
+      </w:rPr>
+    </w:lvl>
+    <w:lvl w:ilvl="7" w:tplc="04090003" w:tentative="1">
+      <w:start w:val="1"/>
+      <w:numFmt w:val="bullet"/>
+      <w:lvlText w:val="o"/>
+      <w:lvlJc w:val="left"/>
+      <w:pPr>
+        <w:ind w:left="5400" w:hanging="360"/>
+      </w:pPr>
+      <w:rPr>
+        <w:rFonts w:ascii="Courier New" w:hAnsi="Courier New" w:cs="Courier New" w:hint="default"/>
+      </w:rPr>
+    </w:lvl>
+    <w:lvl w:ilvl="8" w:tplc="04090005" w:tentative="1">
+      <w:start w:val="1"/>
+      <w:numFmt w:val="bullet"/>
+      <w:lvlText w:val=""/>
+      <w:lvlJc w:val="left"/>
+      <w:pPr>
+        <w:ind w:left="6120" w:hanging="360"/>
+      </w:pPr>
+      <w:rPr>
+        <w:rFonts w:ascii="Wingdings" w:hAnsi="Wingdings" w:hint="default"/>
+      </w:rPr>
+    </w:lvl>
+  </w:abstractNum>
   <w:num w:numId="1" w16cid:durableId="1337147068">
     <w:abstractNumId w:val="0"/>
   </w:num>
   <w:num w:numId="2" w16cid:durableId="207954015">
-    <w:abstractNumId w:val="1"/>
+    <w:abstractNumId w:val="2"/>
   </w:num>
   <w:num w:numId="3" w16cid:durableId="1372222412">
-    <w:abstractNumId w:val="2"/>
+    <w:abstractNumId w:val="3"/>
+  </w:num>
+  <w:num w:numId="4" w16cid:durableId="66541442">
+    <w:abstractNumId w:val="4"/>
+  </w:num>
+  <w:num w:numId="5" w16cid:durableId="1931624958">
+    <w:abstractNumId w:val="5"/>
+  </w:num>
+  <w:num w:numId="6" w16cid:durableId="979187021">
+    <w:abstractNumId w:val="1"/>
   </w:num>
 </w:numbering>
 </file>
@@ -12287,7 +14338,7 @@
   <w:style w:type="paragraph" w:default="1" w:styleId="Normal">
     <w:name w:val="Normal"/>
     <w:qFormat/>
-    <w:rsid w:val="00EB0AFA"/>
+    <w:rsid w:val="00AE1AE7"/>
   </w:style>
   <w:style w:type="paragraph" w:styleId="Heading1">
     <w:name w:val="heading 1"/>
@@ -12929,6 +14980,212 @@
       <w:shd w:val="clear" w:color="auto" w:fill="E1DFDD"/>
     </w:rPr>
   </w:style>
+  <w:style w:type="table" w:styleId="TableGrid">
+    <w:name w:val="Table Grid"/>
+    <w:basedOn w:val="TableNormal"/>
+    <w:uiPriority w:val="39"/>
+    <w:rsid w:val="007F5A20"/>
+    <w:pPr>
+      <w:spacing w:after="0" w:line="240" w:lineRule="auto"/>
+    </w:pPr>
+    <w:tblPr>
+      <w:tblBorders>
+        <w:top w:val="single" w:sz="4" w:space="0" w:color="auto"/>
+        <w:left w:val="single" w:sz="4" w:space="0" w:color="auto"/>
+        <w:bottom w:val="single" w:sz="4" w:space="0" w:color="auto"/>
+        <w:right w:val="single" w:sz="4" w:space="0" w:color="auto"/>
+        <w:insideH w:val="single" w:sz="4" w:space="0" w:color="auto"/>
+        <w:insideV w:val="single" w:sz="4" w:space="0" w:color="auto"/>
+      </w:tblBorders>
+    </w:tblPr>
+  </w:style>
+  <w:style w:type="table" w:styleId="PlainTable1">
+    <w:name w:val="Plain Table 1"/>
+    <w:basedOn w:val="TableNormal"/>
+    <w:uiPriority w:val="41"/>
+    <w:rsid w:val="00AF5609"/>
+    <w:pPr>
+      <w:spacing w:after="0" w:line="240" w:lineRule="auto"/>
+    </w:pPr>
+    <w:tblPr>
+      <w:tblStyleRowBandSize w:val="1"/>
+      <w:tblStyleColBandSize w:val="1"/>
+      <w:tblBorders>
+        <w:top w:val="single" w:sz="4" w:space="0" w:color="BFBFBF" w:themeColor="background1" w:themeShade="BF"/>
+        <w:left w:val="single" w:sz="4" w:space="0" w:color="BFBFBF" w:themeColor="background1" w:themeShade="BF"/>
+        <w:bottom w:val="single" w:sz="4" w:space="0" w:color="BFBFBF" w:themeColor="background1" w:themeShade="BF"/>
+        <w:right w:val="single" w:sz="4" w:space="0" w:color="BFBFBF" w:themeColor="background1" w:themeShade="BF"/>
+        <w:insideH w:val="single" w:sz="4" w:space="0" w:color="BFBFBF" w:themeColor="background1" w:themeShade="BF"/>
+        <w:insideV w:val="single" w:sz="4" w:space="0" w:color="BFBFBF" w:themeColor="background1" w:themeShade="BF"/>
+      </w:tblBorders>
+    </w:tblPr>
+    <w:tblStylePr w:type="firstRow">
+      <w:rPr>
+        <w:b/>
+        <w:bCs/>
+      </w:rPr>
+    </w:tblStylePr>
+    <w:tblStylePr w:type="lastRow">
+      <w:rPr>
+        <w:b/>
+        <w:bCs/>
+      </w:rPr>
+      <w:tblPr/>
+      <w:tcPr>
+        <w:tcBorders>
+          <w:top w:val="double" w:sz="4" w:space="0" w:color="BFBFBF" w:themeColor="background1" w:themeShade="BF"/>
+        </w:tcBorders>
+      </w:tcPr>
+    </w:tblStylePr>
+    <w:tblStylePr w:type="firstCol">
+      <w:rPr>
+        <w:b/>
+        <w:bCs/>
+      </w:rPr>
+    </w:tblStylePr>
+    <w:tblStylePr w:type="lastCol">
+      <w:rPr>
+        <w:b/>
+        <w:bCs/>
+      </w:rPr>
+    </w:tblStylePr>
+    <w:tblStylePr w:type="band1Vert">
+      <w:tblPr/>
+      <w:tcPr>
+        <w:shd w:val="clear" w:color="auto" w:fill="F2F2F2" w:themeFill="background1" w:themeFillShade="F2"/>
+      </w:tcPr>
+    </w:tblStylePr>
+    <w:tblStylePr w:type="band1Horz">
+      <w:tblPr/>
+      <w:tcPr>
+        <w:shd w:val="clear" w:color="auto" w:fill="F2F2F2" w:themeFill="background1" w:themeFillShade="F2"/>
+      </w:tcPr>
+    </w:tblStylePr>
+  </w:style>
+  <w:style w:type="table" w:styleId="ListTable3-Accent1">
+    <w:name w:val="List Table 3 Accent 1"/>
+    <w:basedOn w:val="TableNormal"/>
+    <w:uiPriority w:val="48"/>
+    <w:rsid w:val="00AF5609"/>
+    <w:pPr>
+      <w:spacing w:after="0" w:line="240" w:lineRule="auto"/>
+    </w:pPr>
+    <w:tblPr>
+      <w:tblStyleRowBandSize w:val="1"/>
+      <w:tblStyleColBandSize w:val="1"/>
+      <w:tblBorders>
+        <w:top w:val="single" w:sz="4" w:space="0" w:color="156082" w:themeColor="accent1"/>
+        <w:left w:val="single" w:sz="4" w:space="0" w:color="156082" w:themeColor="accent1"/>
+        <w:bottom w:val="single" w:sz="4" w:space="0" w:color="156082" w:themeColor="accent1"/>
+        <w:right w:val="single" w:sz="4" w:space="0" w:color="156082" w:themeColor="accent1"/>
+      </w:tblBorders>
+    </w:tblPr>
+    <w:tblStylePr w:type="firstRow">
+      <w:rPr>
+        <w:b/>
+        <w:bCs/>
+        <w:color w:val="FFFFFF" w:themeColor="background1"/>
+      </w:rPr>
+      <w:tblPr/>
+      <w:tcPr>
+        <w:shd w:val="clear" w:color="auto" w:fill="156082" w:themeFill="accent1"/>
+      </w:tcPr>
+    </w:tblStylePr>
+    <w:tblStylePr w:type="lastRow">
+      <w:rPr>
+        <w:b/>
+        <w:bCs/>
+      </w:rPr>
+      <w:tblPr/>
+      <w:tcPr>
+        <w:tcBorders>
+          <w:top w:val="double" w:sz="4" w:space="0" w:color="156082" w:themeColor="accent1"/>
+        </w:tcBorders>
+        <w:shd w:val="clear" w:color="auto" w:fill="FFFFFF" w:themeFill="background1"/>
+      </w:tcPr>
+    </w:tblStylePr>
+    <w:tblStylePr w:type="firstCol">
+      <w:rPr>
+        <w:b/>
+        <w:bCs/>
+      </w:rPr>
+      <w:tblPr/>
+      <w:tcPr>
+        <w:tcBorders>
+          <w:right w:val="nil"/>
+        </w:tcBorders>
+        <w:shd w:val="clear" w:color="auto" w:fill="FFFFFF" w:themeFill="background1"/>
+      </w:tcPr>
+    </w:tblStylePr>
+    <w:tblStylePr w:type="lastCol">
+      <w:rPr>
+        <w:b/>
+        <w:bCs/>
+      </w:rPr>
+      <w:tblPr/>
+      <w:tcPr>
+        <w:tcBorders>
+          <w:left w:val="nil"/>
+        </w:tcBorders>
+        <w:shd w:val="clear" w:color="auto" w:fill="FFFFFF" w:themeFill="background1"/>
+      </w:tcPr>
+    </w:tblStylePr>
+    <w:tblStylePr w:type="band1Vert">
+      <w:tblPr/>
+      <w:tcPr>
+        <w:tcBorders>
+          <w:left w:val="single" w:sz="4" w:space="0" w:color="156082" w:themeColor="accent1"/>
+          <w:right w:val="single" w:sz="4" w:space="0" w:color="156082" w:themeColor="accent1"/>
+        </w:tcBorders>
+      </w:tcPr>
+    </w:tblStylePr>
+    <w:tblStylePr w:type="band1Horz">
+      <w:tblPr/>
+      <w:tcPr>
+        <w:tcBorders>
+          <w:top w:val="single" w:sz="4" w:space="0" w:color="156082" w:themeColor="accent1"/>
+          <w:bottom w:val="single" w:sz="4" w:space="0" w:color="156082" w:themeColor="accent1"/>
+          <w:insideH w:val="nil"/>
+        </w:tcBorders>
+      </w:tcPr>
+    </w:tblStylePr>
+    <w:tblStylePr w:type="neCell">
+      <w:tblPr/>
+      <w:tcPr>
+        <w:tcBorders>
+          <w:left w:val="nil"/>
+          <w:bottom w:val="nil"/>
+        </w:tcBorders>
+      </w:tcPr>
+    </w:tblStylePr>
+    <w:tblStylePr w:type="nwCell">
+      <w:tblPr/>
+      <w:tcPr>
+        <w:tcBorders>
+          <w:bottom w:val="nil"/>
+          <w:right w:val="nil"/>
+        </w:tcBorders>
+      </w:tcPr>
+    </w:tblStylePr>
+    <w:tblStylePr w:type="seCell">
+      <w:tblPr/>
+      <w:tcPr>
+        <w:tcBorders>
+          <w:top w:val="double" w:sz="4" w:space="0" w:color="156082" w:themeColor="accent1"/>
+          <w:left w:val="nil"/>
+        </w:tcBorders>
+      </w:tcPr>
+    </w:tblStylePr>
+    <w:tblStylePr w:type="swCell">
+      <w:tblPr/>
+      <w:tcPr>
+        <w:tcBorders>
+          <w:top w:val="double" w:sz="4" w:space="0" w:color="156082" w:themeColor="accent1"/>
+          <w:right w:val="nil"/>
+        </w:tcBorders>
+      </w:tcPr>
+    </w:tblStylePr>
+  </w:style>
 </w:styles>
 </file>
 

</xml_diff>